<commit_message>
iOS mustaqil ishini rasm, grafik va jadvallar bilan (16+ bet) yangiladi
</commit_message>
<xml_diff>
--- a/iOS — Apple mobil operatsion tizimi  MI.docx
+++ b/iOS — Apple mobil operatsion tizimi  MI.docx
@@ -68,7 +68,7 @@
     </w:p>
     <w:p>
       <w:pPr>
-        <w:spacing w:after="1200"/>
+        <w:spacing w:after="1000"/>
       </w:pPr>
     </w:p>
     <w:p>
@@ -119,7 +119,7 @@
     </w:p>
     <w:p>
       <w:pPr>
-        <w:spacing w:after="1200"/>
+        <w:spacing w:after="1000"/>
       </w:pPr>
     </w:p>
     <w:p>
@@ -156,7 +156,7 @@
     </w:p>
     <w:p>
       <w:pPr>
-        <w:spacing w:after="600" w:line="360" w:lineRule="auto"/>
+        <w:spacing w:after="400" w:line="360" w:lineRule="auto"/>
         <w:jc w:val="center"/>
       </w:pPr>
       <w:r>
@@ -172,7 +172,7 @@
     </w:p>
     <w:p>
       <w:pPr>
-        <w:spacing w:after="600"/>
+        <w:spacing w:after="500"/>
       </w:pPr>
     </w:p>
     <w:p>
@@ -239,7 +239,7 @@
           <w:sz w:val="28"/>
           <w:szCs w:val="28"/>
         </w:rPr>
-        <w:t xml:space="preserve">KIRISH</w:t>
+        <w:t xml:space="preserve">KIRISH ......................................................................................... 3</w:t>
       </w:r>
     </w:p>
     <w:p>
@@ -267,7 +267,7 @@
           <w:sz w:val="28"/>
           <w:szCs w:val="28"/>
         </w:rPr>
-        <w:t xml:space="preserve">1. iOS ning xavfsizlik arxitekturasi (Sandboxing, kod imzolash, Touch/Face ID)</w:t>
+        <w:t xml:space="preserve">1. iOS ning xavfsizlik arxitekturasi (Sandboxing, kod imzolash, Touch/Face ID) ... 4</w:t>
       </w:r>
     </w:p>
     <w:p>
@@ -281,7 +281,7 @@
           <w:sz w:val="28"/>
           <w:szCs w:val="28"/>
         </w:rPr>
-        <w:t xml:space="preserve">2. iOS va Android platformalarining dasturchi nuqtai nazaridan farqlari</w:t>
+        <w:t xml:space="preserve">2. iOS va Android platformalarining dasturchi nuqtai nazaridan farqlari ........... 7</w:t>
       </w:r>
     </w:p>
     <w:p>
@@ -295,7 +295,7 @@
           <w:sz w:val="28"/>
           <w:szCs w:val="28"/>
         </w:rPr>
-        <w:t xml:space="preserve">3. iOS App Store modeli va ilovalarni tekshirish jarayoni</w:t>
+        <w:t xml:space="preserve">3. iOS App Store modeli va ilovalarni tekshirish jarayoni ........................... 9</w:t>
       </w:r>
     </w:p>
     <w:p>
@@ -309,7 +309,7 @@
           <w:sz w:val="28"/>
           <w:szCs w:val="28"/>
         </w:rPr>
-        <w:t xml:space="preserve">4. iOS ning asosiy framework lari (UIKit, SwiftUI, CoreData, CoreML)</w:t>
+        <w:t xml:space="preserve">4. iOS ning asosiy framework lari (UIKit, SwiftUI, CoreData, CoreML) ........... 11</w:t>
       </w:r>
     </w:p>
     <w:p>
@@ -323,7 +323,7 @@
           <w:sz w:val="28"/>
           <w:szCs w:val="28"/>
         </w:rPr>
-        <w:t xml:space="preserve">5. iPhone dan iPhone 15 gacha iOS evolyutsiyasining asosiy bosqichlari</w:t>
+        <w:t xml:space="preserve">5. iPhone dan iPhone 15 gacha iOS evolyutsiyasining bosqichlari ................. 13</w:t>
       </w:r>
     </w:p>
     <w:p>
@@ -337,7 +337,7 @@
           <w:sz w:val="28"/>
           <w:szCs w:val="28"/>
         </w:rPr>
-        <w:t xml:space="preserve">AMALIY QISM</w:t>
+        <w:t xml:space="preserve">AMALIY QISM ............................................................................. 15</w:t>
       </w:r>
     </w:p>
     <w:p>
@@ -351,7 +351,7 @@
           <w:sz w:val="28"/>
           <w:szCs w:val="28"/>
         </w:rPr>
-        <w:t xml:space="preserve">XULOSA</w:t>
+        <w:t xml:space="preserve">XULOSA .................................................................................... 16</w:t>
       </w:r>
     </w:p>
     <w:p>
@@ -365,7 +365,7 @@
           <w:sz w:val="28"/>
           <w:szCs w:val="28"/>
         </w:rPr>
-        <w:t xml:space="preserve">FOYDALANILGAN ADABIYOTLAR</w:t>
+        <w:t xml:space="preserve">FOYDALANILGAN ADABIYOTLAR ................................................. 17</w:t>
       </w:r>
     </w:p>
     <w:p>
@@ -401,7 +401,7 @@
           <w:sz w:val="28"/>
           <w:szCs w:val="28"/>
         </w:rPr>
-        <w:t xml:space="preserve">Mavzuning dolzarbligi: Mobil texnologiyalar XXI asrning eng tez rivojlanayotgan sohalaridan biri bo'lib, smartfonlar bugungi kunda nafaqat aloqa vositasi, balki to'lov tizimi, ish quroli va shaxsiy ma'lumotlar ombori vazifasini ham bajaradi. Apple Inc. kompaniyasi tomonidan iPhone va iPad qurilmalari uchun yaratilgan iOS operatsion tizimi global mobil bozorda Android bilan birga yetakchi o'rinni egallaydi. iOS o'zining yuqori darajadagi xavfsizligi, apparat va dasturiy ta'minotning mukammal integratsiyasi hamda barqaror ishlashi bilan ajralib turadi. Kiberhavfsizlik tahdidlari kuchaygan va foydalanuvchilarning shaxsiy ma'lumotlarini himoya qilish dolzarb masalaga aylangan hozirgi davrda iOS ning ichki arxitekturasi, himoya mexanizmlari va ilovalar ekotizimini chuqur o'rganish katta amaliy ahamiyatga ega.</w:t>
+        <w:t xml:space="preserve">Mavzuning dolzarbligi: Mobil texnologiyalar XXI asrning eng tez rivojlanayotgan sohalaridan biri bo'lib, smartfonlar bugungi kunda nafaqat aloqa vositasi, balki to'lov tizimi, ish quroli va shaxsiy ma'lumotlar ombori vazifasini ham bajaradi. Apple Inc. kompaniyasi tomonidan iPhone va iPad qurilmalari uchun yaratilgan iOS operatsion tizimi global mobil bozorda Android bilan birga yetakchi o'rinni egallaydi.</w:t>
       </w:r>
     </w:p>
     <w:p>
@@ -416,7 +416,102 @@
           <w:sz w:val="28"/>
           <w:szCs w:val="28"/>
         </w:rPr>
-        <w:t xml:space="preserve">Mustaqil ishning maqsadi: iOS operatsion tizimining 2007-yildan hozirgi kungacha bo'lgan rivojlanish bosqichlarini tahlil qilish, uning ko'p qatlamli xavfsizlik arxitekturasini (Sandboxing, kod imzolash, biometrik autentifikatsiya), App Store ilovalar ekotizimi va moderatsiya jarayonini, asosiy dasturlash freymvorklari (UIKit, SwiftUI, CoreData, CoreML) vazifalarini o'rganish, shuningdek, iOS ni dasturchi nuqtai nazaridan Android platformasi bilan qiyosiy tahlil qilishdan iborat.</w:t>
+        <w:t xml:space="preserve">Quyidagi diagrammada global mobil operatsion tizimlar bozorining taqsimoti ko'rsatilgan. Garchi miqdoran Android ustun bo'lsa-da, iOS yuqori daromadli segmentda va dasturchilar daromadida yetakchilik qiladi.</w:t>
+      </w:r>
+    </w:p>
+    <w:p>
+      <w:pPr>
+        <w:spacing w:before="120" w:after="40"/>
+        <w:jc w:val="center"/>
+      </w:pPr>
+      <w:r>
+        <w:drawing>
+          <wp:inline distT="0" distB="0" distL="0" distR="0">
+            <wp:extent cx="5580000" cy="3124800"/>
+            <wp:effectExtent l="0" t="0" r="0" b="0"/>
+            <wp:docPr id="101" name="mobile_share"/>
+            <wp:cNvGraphicFramePr>
+              <a:graphicFrameLocks xmlns:a="http://schemas.openxmlformats.org/drawingml/2006/main" noChangeAspect="1"/>
+            </wp:cNvGraphicFramePr>
+            <a:graphic xmlns:a="http://schemas.openxmlformats.org/drawingml/2006/main">
+              <a:graphicData uri="http://schemas.openxmlformats.org/drawingml/2006/picture">
+                <pic:pic xmlns:pic="http://schemas.openxmlformats.org/drawingml/2006/picture">
+                  <pic:nvPicPr>
+                    <pic:cNvPr id="101" name="mobile_share"/>
+                    <pic:cNvPicPr/>
+                  </pic:nvPicPr>
+                  <pic:blipFill>
+                    <a:blip r:embed="rId101"/>
+                    <a:stretch>
+                      <a:fillRect/>
+                    </a:stretch>
+                  </pic:blipFill>
+                  <pic:spPr>
+                    <a:xfrm>
+                      <a:off x="0" y="0"/>
+                      <a:ext cx="5580000" cy="3124800"/>
+                    </a:xfrm>
+                    <a:prstGeom prst="rect">
+                      <a:avLst/>
+                    </a:prstGeom>
+                  </pic:spPr>
+                </pic:pic>
+              </a:graphicData>
+            </a:graphic>
+          </wp:inline>
+        </w:drawing>
+      </w:r>
+    </w:p>
+    <w:p>
+      <w:pPr>
+        <w:spacing w:after="160"/>
+        <w:jc w:val="center"/>
+      </w:pPr>
+      <w:r>
+        <w:rPr>
+          <w:rFonts w:ascii="Times New Roman" w:hAnsi="Times New Roman" w:cs="Times New Roman"/>
+          <w:i/>
+          <w:iCs/>
+          <w:color w:val="555555"/>
+          <w:sz w:val="22"/>
+          <w:szCs w:val="22"/>
+        </w:rPr>
+        <w:t xml:space="preserve">1-rasm. Global mobil OT bozor ulushi</w:t>
+      </w:r>
+    </w:p>
+    <w:p>
+      <w:pPr>
+        <w:spacing w:after="120" w:line="360" w:lineRule="auto"/>
+        <w:jc w:val="both"/>
+        <w:ind w:firstLine="709"/>
+      </w:pPr>
+      <w:r>
+        <w:rPr>
+          <w:rFonts w:ascii="Times New Roman" w:hAnsi="Times New Roman" w:cs="Times New Roman"/>
+          <w:sz w:val="28"/>
+          <w:szCs w:val="28"/>
+        </w:rPr>
+        <w:t xml:space="preserve">iOS o'zining yuqori darajadagi xavfsizligi, apparat va dasturiy ta'minotning mukammal integratsiyasi hamda barqaror ishlashi bilan ajralib turadi. Kiberhavfsizlik tahdidlari kuchaygan va foydalanuvchilarning shaxsiy ma'lumotlarini himoya qilish dolzarb masalaga aylangan hozirgi davrda iOS ning ichki arxitekturasi, himoya mexanizmlari va ilovalar ekotizimini chuqur o'rganish katta amaliy ahamiyatga ega.</w:t>
+      </w:r>
+    </w:p>
+    <w:p>
+      <w:pPr>
+        <w:spacing w:after="120" w:line="360" w:lineRule="auto"/>
+        <w:jc w:val="both"/>
+        <w:ind w:firstLine="709"/>
+      </w:pPr>
+      <w:r>
+        <w:rPr>
+          <w:rFonts w:ascii="Times New Roman" w:hAnsi="Times New Roman" w:cs="Times New Roman"/>
+          <w:sz w:val="28"/>
+          <w:szCs w:val="28"/>
+        </w:rPr>
+        <w:t xml:space="preserve">Mustaqil ishning maqsadi: iOS operatsion tizimining 2007-yildan hozirgi kungacha bo'lgan rivojlanish bosqichlarini tahlil qilish, uning ko'p qatlamli xavfsizlik arxitekturasini (Sandboxing, kod imzolash, biometrik autentifikatsiya), App Store ilovalar ekotizimi va moderatsiya jarayonini, asosiy dasturlash freymvorklari (UIKit, SwiftUI, Core Data, Core ML) vazifalarini o'rganish, shuningdek, iOS ni dasturchi nuqtai nazaridan Android platformasi bilan qiyosiy tahlil qilishdan iborat.</w:t>
+      </w:r>
+    </w:p>
+    <w:p>
+      <w:r>
+        <w:br w:type="page"/>
       </w:r>
     </w:p>
     <w:p>
@@ -463,23 +558,67 @@
           <w:sz w:val="28"/>
           <w:szCs w:val="28"/>
         </w:rPr>
-        <w:t xml:space="preserve">iOS ning xavfsizligi alohida bitta vositaga emas, balki apparat va dasturiy ta'minotning bir-biriga bog'langan ko'p qatlamli tizimiga (defense in depth) asoslanadi. Himoya qurilma yoqilgan dastlabki soniyalardanoq, ya'ni apparat darajasidan boshlanadi.</w:t>
-      </w:r>
-    </w:p>
-    <w:p>
-      <w:pPr>
-        <w:pStyle w:val="3"/>
-        <w:spacing w:before="240" w:after="120"/>
-      </w:pPr>
-      <w:r>
-        <w:rPr>
-          <w:rFonts w:ascii="Times New Roman" w:hAnsi="Times New Roman" w:cs="Times New Roman"/>
-          <w:b/>
-          <w:bCs/>
-          <w:sz w:val="28"/>
-          <w:szCs w:val="28"/>
-        </w:rPr>
-        <w:t xml:space="preserve">Ishonchli yuklash zanjiri (Secure Boot Chain)</w:t>
+        <w:t xml:space="preserve">iOS ning xavfsizligi alohida bitta vositaga emas, balki apparat va dasturiy ta'minotning bir-biriga bog'langan ko'p qatlamli tizimiga (defense in depth — qatlamli mudofaa) asoslanadi. Himoya qurilma yoqilgan dastlabki soniyalardanoq, ya'ni apparat darajasidan boshlanadi. Quyidagi diagramma ushbu qatlamlarni ko'rsatadi:</w:t>
+      </w:r>
+    </w:p>
+    <w:p>
+      <w:pPr>
+        <w:spacing w:before="120" w:after="40"/>
+        <w:jc w:val="center"/>
+      </w:pPr>
+      <w:r>
+        <w:drawing>
+          <wp:inline distT="0" distB="0" distL="0" distR="0">
+            <wp:extent cx="5580000" cy="3720000"/>
+            <wp:effectExtent l="0" t="0" r="0" b="0"/>
+            <wp:docPr id="102" name="security_layers"/>
+            <wp:cNvGraphicFramePr>
+              <a:graphicFrameLocks xmlns:a="http://schemas.openxmlformats.org/drawingml/2006/main" noChangeAspect="1"/>
+            </wp:cNvGraphicFramePr>
+            <a:graphic xmlns:a="http://schemas.openxmlformats.org/drawingml/2006/main">
+              <a:graphicData uri="http://schemas.openxmlformats.org/drawingml/2006/picture">
+                <pic:pic xmlns:pic="http://schemas.openxmlformats.org/drawingml/2006/picture">
+                  <pic:nvPicPr>
+                    <pic:cNvPr id="102" name="security_layers"/>
+                    <pic:cNvPicPr/>
+                  </pic:nvPicPr>
+                  <pic:blipFill>
+                    <a:blip r:embed="rId102"/>
+                    <a:stretch>
+                      <a:fillRect/>
+                    </a:stretch>
+                  </pic:blipFill>
+                  <pic:spPr>
+                    <a:xfrm>
+                      <a:off x="0" y="0"/>
+                      <a:ext cx="5580000" cy="3720000"/>
+                    </a:xfrm>
+                    <a:prstGeom prst="rect">
+                      <a:avLst/>
+                    </a:prstGeom>
+                  </pic:spPr>
+                </pic:pic>
+              </a:graphicData>
+            </a:graphic>
+          </wp:inline>
+        </w:drawing>
+      </w:r>
+    </w:p>
+    <w:p>
+      <w:pPr>
+        <w:spacing w:after="160"/>
+        <w:jc w:val="center"/>
+      </w:pPr>
+      <w:r>
+        <w:rPr>
+          <w:rFonts w:ascii="Times New Roman" w:hAnsi="Times New Roman" w:cs="Times New Roman"/>
+          <w:i/>
+          <w:iCs/>
+          <w:color w:val="555555"/>
+          <w:sz w:val="22"/>
+          <w:szCs w:val="22"/>
+        </w:rPr>
+        <w:t xml:space="preserve">2-rasm. iOS xavfsizlik qatlamlari</w:t>
       </w:r>
     </w:p>
     <w:p>
@@ -494,7 +633,7 @@
           <w:sz w:val="28"/>
           <w:szCs w:val="28"/>
         </w:rPr>
-        <w:t xml:space="preserve">Qurilma yoqilganda protsessordagi o'zgartirib bo'lmaydigan Boot ROM kodi ishga tushadi. Har bir keyingi bosqich (iBoot yuklovchisi, yadro, operatsion tizim) faqat Apple ning raqamli imzosi tekshirilgandan keyingina yuklanadi. Agar zanjirning biron-bir bo'g'inida imzo mos kelmasa, yuklash to'xtatiladi. Bu jarayon zararli dastur tizim darajasiga o'rnashib olishining oldini oladi.</w:t>
+        <w:t xml:space="preserve">Diagrammadan ko'rinib turibdiki, eng quyi va eng ishonchli qatlam — apparat darajasidir. Yuqoriga ko'tarilgan sari komponentlarning imtiyoz darajasi kamayadi, bu esa xavfsizlikni kuchaytiradi.</w:t>
       </w:r>
     </w:p>
     <w:p>
@@ -510,7 +649,7 @@
           <w:sz w:val="28"/>
           <w:szCs w:val="28"/>
         </w:rPr>
-        <w:t xml:space="preserve">Secure Enclave va biometrik autentifikatsiya (Touch ID / Face ID)</w:t>
+        <w:t xml:space="preserve">Ishonchli yuklash zanjiri (Secure Boot Chain)</w:t>
       </w:r>
     </w:p>
     <w:p>
@@ -525,23 +664,67 @@
           <w:sz w:val="28"/>
           <w:szCs w:val="28"/>
         </w:rPr>
-        <w:t xml:space="preserve">Secure Enclave — bu asosiy protsessordan jismonan ajratilgan, mustaqil ishlovchi xavfsizlik koprotsessoridir. U barmoq izi (Touch ID) va yuz tasviri (Face ID) ning matematik ko'rinishini, shuningdek shifrlash kalitlarini saqlaydi. Muhim jihat shundaki, biometrik ma'lumotlarning o'zi hech qachon Apple serverlariga yuborilmaydi va asosiy operatsion tizim ham ularga to'g'ridan-to'g'ri kira olmaydi. Face ID texnologiyasi TrueDepth kamerasi yordamida yuzning 30 mingdan ortiq nuqtali 3D xaritasini tuzadi, bu esa fotosurat orqali aldashning oldini oladi.</w:t>
-      </w:r>
-    </w:p>
-    <w:p>
-      <w:pPr>
-        <w:pStyle w:val="3"/>
-        <w:spacing w:before="240" w:after="120"/>
-      </w:pPr>
-      <w:r>
-        <w:rPr>
-          <w:rFonts w:ascii="Times New Roman" w:hAnsi="Times New Roman" w:cs="Times New Roman"/>
-          <w:b/>
-          <w:bCs/>
-          <w:sz w:val="28"/>
-          <w:szCs w:val="28"/>
-        </w:rPr>
-        <w:t xml:space="preserve">Sandboxing (Qum qutisi prinsipi)</w:t>
+        <w:t xml:space="preserve">Qurilma yoqilganda protsessordagi o'zgartirib bo'lmaydigan Boot ROM kodi ishga tushadi. Har bir keyingi bosqich faqat Apple ning raqamli imzosi tekshirilgandan keyingina yuklanadi. Agar zanjirning biron-bir bo'g'inida imzo mos kelmasa, yuklash to'xtatiladi. Ushbu jarayon quyidagicha ifodalanadi:</w:t>
+      </w:r>
+    </w:p>
+    <w:p>
+      <w:pPr>
+        <w:spacing w:before="120" w:after="40"/>
+        <w:jc w:val="center"/>
+      </w:pPr>
+      <w:r>
+        <w:drawing>
+          <wp:inline distT="0" distB="0" distL="0" distR="0">
+            <wp:extent cx="5580000" cy="1897200"/>
+            <wp:effectExtent l="0" t="0" r="0" b="0"/>
+            <wp:docPr id="103" name="boot_chain"/>
+            <wp:cNvGraphicFramePr>
+              <a:graphicFrameLocks xmlns:a="http://schemas.openxmlformats.org/drawingml/2006/main" noChangeAspect="1"/>
+            </wp:cNvGraphicFramePr>
+            <a:graphic xmlns:a="http://schemas.openxmlformats.org/drawingml/2006/main">
+              <a:graphicData uri="http://schemas.openxmlformats.org/drawingml/2006/picture">
+                <pic:pic xmlns:pic="http://schemas.openxmlformats.org/drawingml/2006/picture">
+                  <pic:nvPicPr>
+                    <pic:cNvPr id="103" name="boot_chain"/>
+                    <pic:cNvPicPr/>
+                  </pic:nvPicPr>
+                  <pic:blipFill>
+                    <a:blip r:embed="rId103"/>
+                    <a:stretch>
+                      <a:fillRect/>
+                    </a:stretch>
+                  </pic:blipFill>
+                  <pic:spPr>
+                    <a:xfrm>
+                      <a:off x="0" y="0"/>
+                      <a:ext cx="5580000" cy="1897200"/>
+                    </a:xfrm>
+                    <a:prstGeom prst="rect">
+                      <a:avLst/>
+                    </a:prstGeom>
+                  </pic:spPr>
+                </pic:pic>
+              </a:graphicData>
+            </a:graphic>
+          </wp:inline>
+        </w:drawing>
+      </w:r>
+    </w:p>
+    <w:p>
+      <w:pPr>
+        <w:spacing w:after="160"/>
+        <w:jc w:val="center"/>
+      </w:pPr>
+      <w:r>
+        <w:rPr>
+          <w:rFonts w:ascii="Times New Roman" w:hAnsi="Times New Roman" w:cs="Times New Roman"/>
+          <w:i/>
+          <w:iCs/>
+          <w:color w:val="555555"/>
+          <w:sz w:val="22"/>
+          <w:szCs w:val="22"/>
+        </w:rPr>
+        <w:t xml:space="preserve">3-rasm. Ishonchli yuklash zanjiri</w:t>
       </w:r>
     </w:p>
     <w:p>
@@ -556,7 +739,7 @@
           <w:sz w:val="28"/>
           <w:szCs w:val="28"/>
         </w:rPr>
-        <w:t xml:space="preserve">iOS da har bir ilova alohida izolyatsiyalangan muhitda — 'qum qutisida' ishlaydi. Ilova faqat o'ziga ajratilgan katalog va resurslarga kira oladi, boshqa ilovalarning ma'lumotlariga yoki tizim fayllariga ruxsatsiz murojaat qila olmaydi. Kamera, mikrofon, geolokatsiya yoki kontaktlar kabi maxfiy resurslardan foydalanish uchun ilova foydalanuvchidan aniq ruxsat (permission) so'rashi shart. Bu mexanizm bitta ilovadagi zaiflik butun tizimga tarqalishining oldini oladi.</w:t>
+        <w:t xml:space="preserve">Bu mexanizm zararli dasturning tizim darajasiga o'rnashib olishi va qurilmani nazoratga olishining oldini oladi.</w:t>
       </w:r>
     </w:p>
     <w:p>
@@ -572,7 +755,7 @@
           <w:sz w:val="28"/>
           <w:szCs w:val="28"/>
         </w:rPr>
-        <w:t xml:space="preserve">Kod imzolash (Code Signing)</w:t>
+        <w:t xml:space="preserve">Secure Enclave va biometrik autentifikatsiya (Touch ID / Face ID)</w:t>
       </w:r>
     </w:p>
     <w:p>
@@ -587,12 +770,12 @@
           <w:sz w:val="28"/>
           <w:szCs w:val="28"/>
         </w:rPr>
-        <w:t xml:space="preserve">iOS da faqat Apple tomonidan tasdiqlangan sertifikat bilan imzolangan kodgina ishga tushirilishi mumkin. Dasturchi ilovani o'zining Apple Developer sertifikati bilan imzolaydi, qurilma esa har safar ilova ishga tushganda imzoning haqiqiyligini tekshiradi. Bu yondashuv internetdan tushgan tasdiqlanmagan yoki o'zgartirilgan dasturlarning ishga tushishini bloklaydi. Ma'lumotlarni himoya qilish uchun esa Data Protection mexanizmi qo'llanilib, fayllar qurilma bloklangan holatda apparat darajasida shifrlanadi.</w:t>
-      </w:r>
-    </w:p>
-    <w:p>
-      <w:pPr>
-        <w:pStyle w:val="2"/>
+        <w:t xml:space="preserve">Secure Enclave — bu asosiy protsessordan jismonan ajratilgan, mustaqil ishlovchi xavfsizlik koprotsessoridir. U barmoq izi (Touch ID) va yuz tasviri (Face ID) ning matematik ko'rinishini, shuningdek shifrlash kalitlarini saqlaydi. Muhim jihat shundaki, biometrik ma'lumotlarning o'zi hech qachon Apple serverlariga yuborilmaydi va asosiy operatsion tizim ham ularga to'g'ridan-to'g'ri kira olmaydi. Face ID texnologiyasi TrueDepth kamerasi yordamida yuzning 30 mingdan ortiq nuqtali 3D xaritasini tuzadi, bu esa oddiy fotosurat orqali aldashning oldini oladi.</w:t>
+      </w:r>
+    </w:p>
+    <w:p>
+      <w:pPr>
+        <w:pStyle w:val="3"/>
         <w:spacing w:before="240" w:after="120"/>
       </w:pPr>
       <w:r>
@@ -603,7 +786,7 @@
           <w:sz w:val="28"/>
           <w:szCs w:val="28"/>
         </w:rPr>
-        <w:t xml:space="preserve">2. iOS va Android platformalarining dasturchi nuqtai nazaridan farqlari</w:t>
+        <w:t xml:space="preserve">Sandboxing (Qum qutisi prinsipi)</w:t>
       </w:r>
     </w:p>
     <w:p>
@@ -618,7 +801,23 @@
           <w:sz w:val="28"/>
           <w:szCs w:val="28"/>
         </w:rPr>
-        <w:t xml:space="preserve">Garchi ikkala platforma ham mobil ilovalar yaratishga mo'ljallangan bo'lsa-da, ularning falsafasi va dasturlash jarayoni sezilarli farq qiladi.</w:t>
+        <w:t xml:space="preserve">iOS da har bir ilova alohida izolyatsiyalangan muhitda — 'qum qutisida' ishlaydi. Ilova faqat o'ziga ajratilgan katalog va resurslarga kira oladi, boshqa ilovalarning ma'lumotlariga yoki tizim fayllariga ruxsatsiz murojaat qila olmaydi. Kamera, mikrofon, geolokatsiya yoki kontaktlar kabi maxfiy resurslardan foydalanish uchun ilova foydalanuvchidan aniq ruxsat (permission) so'rashi shart. Bu mexanizm bitta ilovadagi zaiflik butun tizimga tarqalishining oldini oladi.</w:t>
+      </w:r>
+    </w:p>
+    <w:p>
+      <w:pPr>
+        <w:pStyle w:val="3"/>
+        <w:spacing w:before="240" w:after="120"/>
+      </w:pPr>
+      <w:r>
+        <w:rPr>
+          <w:rFonts w:ascii="Times New Roman" w:hAnsi="Times New Roman" w:cs="Times New Roman"/>
+          <w:b/>
+          <w:bCs/>
+          <w:sz w:val="28"/>
+          <w:szCs w:val="28"/>
+        </w:rPr>
+        <w:t xml:space="preserve">Kod imzolash (Code Signing)</w:t>
       </w:r>
     </w:p>
     <w:p>
@@ -633,7 +832,7 @@
           <w:sz w:val="28"/>
           <w:szCs w:val="28"/>
         </w:rPr>
-        <w:t xml:space="preserve">Dasturlash tillari va muhiti: iOS uchun ilovalar asosan Swift (va eski Objective-C) tilida, faqat Apple ning macOS operatsion tizimida ishlovchi Xcode muhitida yoziladi. Android uchun esa Kotlin va Java tillari hamda Android Studio ishlatilib, ishlab chiqishni Windows, macOS yoki Linux da olib borish mumkin.</w:t>
+        <w:t xml:space="preserve">iOS da faqat Apple tomonidan tasdiqlangan sertifikat bilan imzolangan kodgina ishga tushirilishi mumkin. Dasturchi ilovani o'zining Apple Developer sertifikati bilan imzolaydi, qurilma esa har safar ilova ishga tushganda imzoning haqiqiyligini tekshiradi. Bu yondashuv internetdan tushgan tasdiqlanmagan dasturlarning ishga tushishini bloklaydi.</w:t>
       </w:r>
     </w:p>
     <w:p>
@@ -648,506 +847,7 @@
           <w:sz w:val="28"/>
           <w:szCs w:val="28"/>
         </w:rPr>
-        <w:t xml:space="preserve">Ekotizimning yopiqligi: iOS — yopiq ('walled garden') ekotizim bo'lib, Apple apparat va dasturiy ta'minotni to'liq nazorat qiladi. Qurilmalar turi cheklangani uchun dasturchi kamroq modellarga moslashtirish ishini bajaradi. Android esa ochiq tizim bo'lib, yuzlab ishlab chiqaruvchilarning turli ekran o'lchami va apparatiga ega qurilmalarida ishlaydi — bu 'fragmentatsiya' muammosini keltirib chiqaradi va testlashni murakkablashtiradi.</w:t>
-      </w:r>
-    </w:p>
-    <w:p>
-      <w:pPr>
-        <w:spacing w:after="120" w:line="360" w:lineRule="auto"/>
-        <w:jc w:val="both"/>
-        <w:ind w:firstLine="709"/>
-      </w:pPr>
-      <w:r>
-        <w:rPr>
-          <w:rFonts w:ascii="Times New Roman" w:hAnsi="Times New Roman" w:cs="Times New Roman"/>
-          <w:sz w:val="28"/>
-          <w:szCs w:val="28"/>
-        </w:rPr>
-        <w:t xml:space="preserve">Ilovalarni tarqatish: iOS ilovalari faqat rasmiy App Store orqali (yoki korporativ tarqatish kanallari bilan) o'rnatiladi. Android da esa rasmiy Google Play bilan bir qatorda APK fayllarini boshqa manbalardan ham o'rnatish (sideloading) mumkin, bu moslashuvchanlikni oshirsa-da, xavfsizlik xatarini ko'taradi.</w:t>
-      </w:r>
-    </w:p>
-    <w:p>
-      <w:pPr>
-        <w:spacing w:after="120" w:line="360" w:lineRule="auto"/>
-        <w:jc w:val="both"/>
-        <w:ind w:firstLine="709"/>
-      </w:pPr>
-      <w:r>
-        <w:rPr>
-          <w:rFonts w:ascii="Times New Roman" w:hAnsi="Times New Roman" w:cs="Times New Roman"/>
-          <w:sz w:val="28"/>
-          <w:szCs w:val="28"/>
-        </w:rPr>
-        <w:t xml:space="preserve">Daromad va yangilanishlar: Statistik jihatdan iOS foydalanuvchilari ilovalarga ko'proq pul sarflashga moyil, shu sababli dasturchilar daromad olishda iOS ni ustun ko'radi. Bundan tashqari, yangi iOS versiyasi barcha mos qurilmalarga bir vaqtda yetib boradi, Android da esa yangilanishlar ishlab chiqaruvchiga bog'liq holda sekin tarqaladi.</w:t>
-      </w:r>
-    </w:p>
-    <w:p>
-      <w:pPr>
-        <w:pStyle w:val="2"/>
-        <w:spacing w:before="240" w:after="120"/>
-      </w:pPr>
-      <w:r>
-        <w:rPr>
-          <w:rFonts w:ascii="Times New Roman" w:hAnsi="Times New Roman" w:cs="Times New Roman"/>
-          <w:b/>
-          <w:bCs/>
-          <w:sz w:val="28"/>
-          <w:szCs w:val="28"/>
-        </w:rPr>
-        <w:t xml:space="preserve">3. iOS App Store modeli va ilovalarni tekshirish jarayoni</w:t>
-      </w:r>
-    </w:p>
-    <w:p>
-      <w:pPr>
-        <w:spacing w:after="120" w:line="360" w:lineRule="auto"/>
-        <w:jc w:val="both"/>
-        <w:ind w:firstLine="709"/>
-      </w:pPr>
-      <w:r>
-        <w:rPr>
-          <w:rFonts w:ascii="Times New Roman" w:hAnsi="Times New Roman" w:cs="Times New Roman"/>
-          <w:sz w:val="28"/>
-          <w:szCs w:val="28"/>
-        </w:rPr>
-        <w:t xml:space="preserve">App Store — bu 2008-yilda ishga tushirilgan, iOS ilovalarini tarqatishning yagona rasmiy markazlashtirilgan platformasidir. Apple ning bu boradagi siyosati qat'iy moderatsiyaga asoslanadi va asosiy maqsadi foydalanuvchi xavfsizligi hamda ilovalar sifatini ta'minlashdir.</w:t>
-      </w:r>
-    </w:p>
-    <w:p>
-      <w:pPr>
-        <w:spacing w:after="120" w:line="360" w:lineRule="auto"/>
-        <w:jc w:val="both"/>
-        <w:ind w:firstLine="709"/>
-      </w:pPr>
-      <w:r>
-        <w:rPr>
-          <w:rFonts w:ascii="Times New Roman" w:hAnsi="Times New Roman" w:cs="Times New Roman"/>
-          <w:sz w:val="28"/>
-          <w:szCs w:val="28"/>
-        </w:rPr>
-        <w:t xml:space="preserve">Ilovani joylash bosqichlari: Dasturchi avval Apple Developer Program a'zoligini (yillik to'lov asosida) rasmiylashtiradi. So'ngra Xcode yordamida tayyorlangan ilova App Store Connect platformasiga yuklanadi va ko'rib chiqishga (review) yuboriladi.</w:t>
-      </w:r>
-    </w:p>
-    <w:p>
-      <w:pPr>
-        <w:spacing w:after="120" w:line="360" w:lineRule="auto"/>
-        <w:jc w:val="both"/>
-        <w:ind w:firstLine="709"/>
-      </w:pPr>
-      <w:r>
-        <w:rPr>
-          <w:rFonts w:ascii="Times New Roman" w:hAnsi="Times New Roman" w:cs="Times New Roman"/>
-          <w:sz w:val="28"/>
-          <w:szCs w:val="28"/>
-        </w:rPr>
-        <w:t xml:space="preserve">Tekshirish (App Review) jarayoni: Har bir ilova maxsus mutaxassislar jamoasi tomonidan App Store Review Guidelines hujjati asosida sinovdan o'tkaziladi. Tekshiruv ham avtomatlashtirilgan vositalar, ham inson nazorati orqali amalga oshiriladi. Quyidagi mezonlarga e'tibor qaratiladi:</w:t>
-      </w:r>
-    </w:p>
-    <w:p>
-      <w:pPr>
-        <w:spacing w:after="60" w:line="360" w:lineRule="auto"/>
-        <w:ind w:left="709" w:hanging="284"/>
-        <w:jc w:val="both"/>
-      </w:pPr>
-      <w:r>
-        <w:rPr>
-          <w:rFonts w:ascii="Times New Roman" w:hAnsi="Times New Roman" w:cs="Times New Roman"/>
-          <w:sz w:val="28"/>
-          <w:szCs w:val="28"/>
-        </w:rPr>
-        <w:t xml:space="preserve">•  Xavfsizlik: ilovada zararli kod yoki maxfiy ma'lumotlarni ruxsatsiz yig'ish holatlari bo'lmasligi;</w:t>
-      </w:r>
-    </w:p>
-    <w:p>
-      <w:pPr>
-        <w:spacing w:after="60" w:line="360" w:lineRule="auto"/>
-        <w:ind w:left="709" w:hanging="284"/>
-        <w:jc w:val="both"/>
-      </w:pPr>
-      <w:r>
-        <w:rPr>
-          <w:rFonts w:ascii="Times New Roman" w:hAnsi="Times New Roman" w:cs="Times New Roman"/>
-          <w:sz w:val="28"/>
-          <w:szCs w:val="28"/>
-        </w:rPr>
-        <w:t xml:space="preserve">•  Funksionallik: ilova ishdan chiqmasligi (crash qilmasligi) va e'lon qilingan vazifalarni bajarishi;</w:t>
-      </w:r>
-    </w:p>
-    <w:p>
-      <w:pPr>
-        <w:spacing w:after="60" w:line="360" w:lineRule="auto"/>
-        <w:ind w:left="709" w:hanging="284"/>
-        <w:jc w:val="both"/>
-      </w:pPr>
-      <w:r>
-        <w:rPr>
-          <w:rFonts w:ascii="Times New Roman" w:hAnsi="Times New Roman" w:cs="Times New Roman"/>
-          <w:sz w:val="28"/>
-          <w:szCs w:val="28"/>
-        </w:rPr>
-        <w:t xml:space="preserve">•  Maxfiylik: foydalanuvchi ma'lumotlaridan foydalanish uchun aniq ruxsat so'rash va maxfiylik siyosatining mavjudligi;</w:t>
-      </w:r>
-    </w:p>
-    <w:p>
-      <w:pPr>
-        <w:spacing w:after="60" w:line="360" w:lineRule="auto"/>
-        <w:ind w:left="709" w:hanging="284"/>
-        <w:jc w:val="both"/>
-      </w:pPr>
-      <w:r>
-        <w:rPr>
-          <w:rFonts w:ascii="Times New Roman" w:hAnsi="Times New Roman" w:cs="Times New Roman"/>
-          <w:sz w:val="28"/>
-          <w:szCs w:val="28"/>
-        </w:rPr>
-        <w:t xml:space="preserve">•  Mazmun: noqonuniy, zo'ravonlik yoki mualliflik huquqini buzuvchi kontentning yo'qligi.</w:t>
-      </w:r>
-    </w:p>
-    <w:p>
-      <w:pPr>
-        <w:spacing w:after="120" w:line="360" w:lineRule="auto"/>
-        <w:jc w:val="both"/>
-        <w:ind w:firstLine="709"/>
-      </w:pPr>
-      <w:r>
-        <w:rPr>
-          <w:rFonts w:ascii="Times New Roman" w:hAnsi="Times New Roman" w:cs="Times New Roman"/>
-          <w:sz w:val="28"/>
-          <w:szCs w:val="28"/>
-        </w:rPr>
-        <w:t xml:space="preserve">Tasdiqdan o'tgan ilova App Store da e'lon qilinadi. Ilova ichidagi xaridlar (In-App Purchase) va obunalar Apple ning to'lov tizimi orqali amalga oshirilib, bundan ma'lum foiz komissiya (odatda 15–30%) ushlab qolinadi. Bu nazorat tizimi zararli ilovalar sonini keskin kamaytirsa-da, ko'pincha 'monopoliya' tanqidlariga sabab bo'ladi.</w:t>
-      </w:r>
-    </w:p>
-    <w:p>
-      <w:pPr>
-        <w:pStyle w:val="2"/>
-        <w:spacing w:before="240" w:after="120"/>
-      </w:pPr>
-      <w:r>
-        <w:rPr>
-          <w:rFonts w:ascii="Times New Roman" w:hAnsi="Times New Roman" w:cs="Times New Roman"/>
-          <w:b/>
-          <w:bCs/>
-          <w:sz w:val="28"/>
-          <w:szCs w:val="28"/>
-        </w:rPr>
-        <w:t xml:space="preserve">4. iOS ning asosiy framework lari (UIKit, SwiftUI, CoreData, CoreML)</w:t>
-      </w:r>
-    </w:p>
-    <w:p>
-      <w:pPr>
-        <w:spacing w:after="120" w:line="360" w:lineRule="auto"/>
-        <w:jc w:val="both"/>
-        <w:ind w:firstLine="709"/>
-      </w:pPr>
-      <w:r>
-        <w:rPr>
-          <w:rFonts w:ascii="Times New Roman" w:hAnsi="Times New Roman" w:cs="Times New Roman"/>
-          <w:sz w:val="28"/>
-          <w:szCs w:val="28"/>
-        </w:rPr>
-        <w:t xml:space="preserve">Apple dasturchilarga ilova yaratishni osonlashtiruvchi tayyor kutubxonalar — freymvorklar to'plamini taqdim etadi. Ularning har biri muayyan vazifaga ixtisoslashgan.</w:t>
-      </w:r>
-    </w:p>
-    <w:p>
-      <w:pPr>
-        <w:spacing w:after="120" w:line="360" w:lineRule="auto"/>
-        <w:jc w:val="both"/>
-        <w:ind w:firstLine="709"/>
-      </w:pPr>
-      <w:r>
-        <w:rPr>
-          <w:rFonts w:ascii="Times New Roman" w:hAnsi="Times New Roman" w:cs="Times New Roman"/>
-          <w:sz w:val="28"/>
-          <w:szCs w:val="28"/>
-        </w:rPr>
-        <w:t xml:space="preserve">UIKit: 2008-yildan beri qo'llanilib kelinayotgan, foydalanuvchi interfeysini (tugma, ro'yxat, oyna, animatsiya) yaratish uchun mo'ljallangan asosiy va eng yetuk freymvork. U imperativ yondashuvga asoslangan bo'lib, interfeys elementlarini qadamma-qadam boshqarishni talab qiladi.</w:t>
-      </w:r>
-    </w:p>
-    <w:p>
-      <w:pPr>
-        <w:spacing w:after="120" w:line="360" w:lineRule="auto"/>
-        <w:jc w:val="both"/>
-        <w:ind w:firstLine="709"/>
-      </w:pPr>
-      <w:r>
-        <w:rPr>
-          <w:rFonts w:ascii="Times New Roman" w:hAnsi="Times New Roman" w:cs="Times New Roman"/>
-          <w:sz w:val="28"/>
-          <w:szCs w:val="28"/>
-        </w:rPr>
-        <w:t xml:space="preserve">SwiftUI: 2019-yilda taqdim etilgan zamonaviy, deklarativ freymvork. Bunda dasturchi interfeysning qanday ko'rinishi kerakligini tavsiflaydi, tizim esa uni avtomatik chizadi va ma'lumot o'zgarganda yangilaydi. SwiftUI bitta kod bazasidan iPhone, iPad, Mac, Apple Watch va Apple TV uchun bir vaqtda interfeys yaratish imkonini beradi, bu esa ishlab chiqishni sezilarli tezlashtiradi.</w:t>
-      </w:r>
-    </w:p>
-    <w:p>
-      <w:pPr>
-        <w:spacing w:after="120" w:line="360" w:lineRule="auto"/>
-        <w:jc w:val="both"/>
-        <w:ind w:firstLine="709"/>
-      </w:pPr>
-      <w:r>
-        <w:rPr>
-          <w:rFonts w:ascii="Times New Roman" w:hAnsi="Times New Roman" w:cs="Times New Roman"/>
-          <w:sz w:val="28"/>
-          <w:szCs w:val="28"/>
-        </w:rPr>
-        <w:t xml:space="preserve">Core Data: ilova ma'lumotlarini qurilma ichida saqlash va boshqarish uchun ishlatiladigan ramka (persistence framework). U ma'lumotlar bazasi (odatda SQLite) ustida obyektga yo'naltirilgan qatlam vazifasini bajarib, dasturchini past darajadagi SQL so'rovlaridan ozod qiladi va obyektlarning o'zaro bog'lanishini boshqaradi.</w:t>
-      </w:r>
-    </w:p>
-    <w:p>
-      <w:pPr>
-        <w:spacing w:after="120" w:line="360" w:lineRule="auto"/>
-        <w:jc w:val="both"/>
-        <w:ind w:firstLine="709"/>
-      </w:pPr>
-      <w:r>
-        <w:rPr>
-          <w:rFonts w:ascii="Times New Roman" w:hAnsi="Times New Roman" w:cs="Times New Roman"/>
-          <w:sz w:val="28"/>
-          <w:szCs w:val="28"/>
-        </w:rPr>
-        <w:t xml:space="preserve">Core ML: 2017-yilda joriy etilgan, sun'iy intellekt va mashinaviy o'qitish modellarini qurilma ichida ishlatish uchun mo'ljallangan freymvork. Hisob-kitoblar bevosita qurilmada (on-device) amalga oshirilgani uchun ma'lumotlar tashqi serverga yuborilmaydi — bu maxfiylikni ta'minlaydi va internetsiz ham tez ishlashga imkon beradi. Core ML tasvirni tanish, tabiiy tilni qayta ishlash va ovozni aniqlash kabi vazifalarda qo'llaniladi.</w:t>
-      </w:r>
-    </w:p>
-    <w:p>
-      <w:pPr>
-        <w:pStyle w:val="2"/>
-        <w:spacing w:before="240" w:after="120"/>
-      </w:pPr>
-      <w:r>
-        <w:rPr>
-          <w:rFonts w:ascii="Times New Roman" w:hAnsi="Times New Roman" w:cs="Times New Roman"/>
-          <w:b/>
-          <w:bCs/>
-          <w:sz w:val="28"/>
-          <w:szCs w:val="28"/>
-        </w:rPr>
-        <w:t xml:space="preserve">5. iPhone dan iPhone 15 gacha iOS evolyutsiyasining asosiy bosqichlari</w:t>
-      </w:r>
-    </w:p>
-    <w:p>
-      <w:pPr>
-        <w:spacing w:after="120" w:line="360" w:lineRule="auto"/>
-        <w:jc w:val="both"/>
-        <w:ind w:firstLine="709"/>
-      </w:pPr>
-      <w:r>
-        <w:rPr>
-          <w:rFonts w:ascii="Times New Roman" w:hAnsi="Times New Roman" w:cs="Times New Roman"/>
-          <w:sz w:val="28"/>
-          <w:szCs w:val="28"/>
-        </w:rPr>
-        <w:t xml:space="preserve">iOS ning rivojlanish tarixi 2007-yilda birinchi iPhone bilan boshlangan va shu vaqtdan beri har yili yangi versiya chiqarilib kelinmoqda.</w:t>
-      </w:r>
-    </w:p>
-    <w:p>
-      <w:pPr>
-        <w:spacing w:after="120" w:line="360" w:lineRule="auto"/>
-        <w:jc w:val="both"/>
-        <w:ind w:firstLine="709"/>
-      </w:pPr>
-      <w:r>
-        <w:rPr>
-          <w:rFonts w:ascii="Times New Roman" w:hAnsi="Times New Roman" w:cs="Times New Roman"/>
-          <w:sz w:val="28"/>
-          <w:szCs w:val="28"/>
-        </w:rPr>
-        <w:t xml:space="preserve">iPhone OS 1 (2007): Dastlab 'iPhone OS' deb atalgan bu tizimda hali uchinchi tomon ilovalari va App Store mavjud emas edi. Asosiy yangilik — barmoq bilan boshqariladigan sensorli multitouch interfeys bo'ldi.</w:t>
-      </w:r>
-    </w:p>
-    <w:p>
-      <w:pPr>
-        <w:spacing w:after="120" w:line="360" w:lineRule="auto"/>
-        <w:jc w:val="both"/>
-        <w:ind w:firstLine="709"/>
-      </w:pPr>
-      <w:r>
-        <w:rPr>
-          <w:rFonts w:ascii="Times New Roman" w:hAnsi="Times New Roman" w:cs="Times New Roman"/>
-          <w:sz w:val="28"/>
-          <w:szCs w:val="28"/>
-        </w:rPr>
-        <w:t xml:space="preserve">iPhone OS 2–3 (2008–2009): App Store ishga tushirilib, dasturchilar uchun ekotizim ochildi. Copy-Paste va MMS kabi asosiy funksiyalar qo'shildi.</w:t>
-      </w:r>
-    </w:p>
-    <w:p>
-      <w:pPr>
-        <w:spacing w:after="120" w:line="360" w:lineRule="auto"/>
-        <w:jc w:val="both"/>
-        <w:ind w:firstLine="709"/>
-      </w:pPr>
-      <w:r>
-        <w:rPr>
-          <w:rFonts w:ascii="Times New Roman" w:hAnsi="Times New Roman" w:cs="Times New Roman"/>
-          <w:sz w:val="28"/>
-          <w:szCs w:val="28"/>
-        </w:rPr>
-        <w:t xml:space="preserve">iOS 4–6 (2010–2012): Tizim rasman 'iOS' nomini oldi. Ko'p vazifalilik (multitasking), papkalar, Siri ovozli yordamchisi (iOS 5) va Apple ning o'z xaritalari joriy etildi.</w:t>
-      </w:r>
-    </w:p>
-    <w:p>
-      <w:pPr>
-        <w:spacing w:after="120" w:line="360" w:lineRule="auto"/>
-        <w:jc w:val="both"/>
-        <w:ind w:firstLine="709"/>
-      </w:pPr>
-      <w:r>
-        <w:rPr>
-          <w:rFonts w:ascii="Times New Roman" w:hAnsi="Times New Roman" w:cs="Times New Roman"/>
-          <w:sz w:val="28"/>
-          <w:szCs w:val="28"/>
-        </w:rPr>
-        <w:t xml:space="preserve">iOS 7 (2013): Dizaynda tub burilish — skeuomorfizmdan voz kechilib, tekis (flat) va minimalistik dizaynga o'tildi. Bu interfeys uslubi asosi bugungacha saqlanib qolgan.</w:t>
-      </w:r>
-    </w:p>
-    <w:p>
-      <w:pPr>
-        <w:spacing w:after="120" w:line="360" w:lineRule="auto"/>
-        <w:jc w:val="both"/>
-        <w:ind w:firstLine="709"/>
-      </w:pPr>
-      <w:r>
-        <w:rPr>
-          <w:rFonts w:ascii="Times New Roman" w:hAnsi="Times New Roman" w:cs="Times New Roman"/>
-          <w:sz w:val="28"/>
-          <w:szCs w:val="28"/>
-        </w:rPr>
-        <w:t xml:space="preserve">iOS 8–12 (2014–2018): Apple Pay to'lov tizimi, ilovalar o'rtasida o'zaro aloqa, Face ID (iPhone X bilan, 2017), 'Screen Time' va ishlash barqarorligini oshirish kabi yangiliklar kiritildi.</w:t>
-      </w:r>
-    </w:p>
-    <w:p>
-      <w:pPr>
-        <w:spacing w:after="120" w:line="360" w:lineRule="auto"/>
-        <w:jc w:val="both"/>
-        <w:ind w:firstLine="709"/>
-      </w:pPr>
-      <w:r>
-        <w:rPr>
-          <w:rFonts w:ascii="Times New Roman" w:hAnsi="Times New Roman" w:cs="Times New Roman"/>
-          <w:sz w:val="28"/>
-          <w:szCs w:val="28"/>
-        </w:rPr>
-        <w:t xml:space="preserve">iOS 13–16 (2019–2022): Tungi rejim (Dark Mode), maxfiylikni kuchaytiruvchi sozlamalar (App Tracking Transparency), bosh ekran vidjetlari va bloklash ekranini chuqur sozlash imkoniyatlari qo'shildi.</w:t>
-      </w:r>
-    </w:p>
-    <w:p>
-      <w:pPr>
-        <w:spacing w:after="120" w:line="360" w:lineRule="auto"/>
-        <w:jc w:val="both"/>
-        <w:ind w:firstLine="709"/>
-      </w:pPr>
-      <w:r>
-        <w:rPr>
-          <w:rFonts w:ascii="Times New Roman" w:hAnsi="Times New Roman" w:cs="Times New Roman"/>
-          <w:sz w:val="28"/>
-          <w:szCs w:val="28"/>
-        </w:rPr>
-        <w:t xml:space="preserve">iOS 17 va iPhone 15 (2023): iPhone 15 modeli bilan Apple birinchi marta o'zining Lightning ulagichidan voz kechib, universal USB-C standartiga o'tdi. Bundan tashqari Pro modellarida titan korpus va kuchli A17 Pro chipi taqdim etilib, qurilma o'yin va sun'iy intellekt vazifalari uchun yanada quvvatli bo'ldi.</w:t>
-      </w:r>
-    </w:p>
-    <w:p>
-      <w:pPr>
-        <w:pStyle w:val="1"/>
-        <w:spacing w:before="240" w:after="120"/>
-      </w:pPr>
-      <w:r>
-        <w:rPr>
-          <w:rFonts w:ascii="Times New Roman" w:hAnsi="Times New Roman" w:cs="Times New Roman"/>
-          <w:b/>
-          <w:bCs/>
-          <w:sz w:val="30"/>
-          <w:szCs w:val="30"/>
-        </w:rPr>
-        <w:t xml:space="preserve">AMALIY QISM</w:t>
-      </w:r>
-    </w:p>
-    <w:p>
-      <w:pPr>
-        <w:pStyle w:val="3"/>
-        <w:spacing w:before="240" w:after="120"/>
-      </w:pPr>
-      <w:r>
-        <w:rPr>
-          <w:rFonts w:ascii="Times New Roman" w:hAnsi="Times New Roman" w:cs="Times New Roman"/>
-          <w:b/>
-          <w:bCs/>
-          <w:sz w:val="28"/>
-          <w:szCs w:val="28"/>
-        </w:rPr>
-        <w:t xml:space="preserve">iOS xavfsizlik qatlamlari va ilova ishga tushish zanjiri</w:t>
-      </w:r>
-    </w:p>
-    <w:p>
-      <w:pPr>
-        <w:spacing w:after="120" w:line="360" w:lineRule="auto"/>
-        <w:jc w:val="both"/>
-        <w:ind w:firstLine="709"/>
-      </w:pPr>
-      <w:r>
-        <w:rPr>
-          <w:rFonts w:ascii="Times New Roman" w:hAnsi="Times New Roman" w:cs="Times New Roman"/>
-          <w:sz w:val="28"/>
-          <w:szCs w:val="28"/>
-        </w:rPr>
-        <w:t xml:space="preserve">Quyidagi mantiqiy zanjir foydalanuvchi ilovani ishga tushirganda himoya mexanizmlari qanday ketma-ketlikda ishlashini ko'rsatadi:</w:t>
-      </w:r>
-    </w:p>
-    <w:p>
-      <w:pPr>
-        <w:spacing w:after="120" w:line="360" w:lineRule="auto"/>
-        <w:jc w:val="both"/>
-      </w:pPr>
-      <w:r>
-        <w:rPr>
-          <w:rFonts w:ascii="Times New Roman" w:hAnsi="Times New Roman" w:cs="Times New Roman"/>
-          <w:sz w:val="28"/>
-          <w:szCs w:val="28"/>
-        </w:rPr>
-        <w:t xml:space="preserve">Qurilma yoqilishi → Boot ROM (apparat ishonch ildizi) → imzo tekshiruvi → iBoot yuklovchisi → iOS yadrosi → ilova kod imzosi tekshiruvi → ilova Sandbox ichida ishga tushishi → maxfiy resurslar uchun foydalanuvchi ruxsati so'ralishi → Secure Enclave orqali biometrik tasdiqlash.</w:t>
-      </w:r>
-    </w:p>
-    <w:p>
-      <w:pPr>
-        <w:spacing w:after="120" w:line="360" w:lineRule="auto"/>
-        <w:jc w:val="both"/>
-        <w:ind w:firstLine="709"/>
-      </w:pPr>
-      <w:r>
-        <w:rPr>
-          <w:rFonts w:ascii="Times New Roman" w:hAnsi="Times New Roman" w:cs="Times New Roman"/>
-          <w:sz w:val="28"/>
-          <w:szCs w:val="28"/>
-        </w:rPr>
-        <w:t xml:space="preserve">Ushbu zanjir shuni ko'rsatadiki, iOS da hech bir ilova himoya bosqichlarini chetlab o'tib to'g'ridan-to'g'ri apparatga yoki boshqa ilova ma'lumotlariga kira olmaydi — har bir murojaat tizim nazoratidan o'tadi.</w:t>
-      </w:r>
-    </w:p>
-    <w:p>
-      <w:pPr>
-        <w:pStyle w:val="3"/>
-        <w:spacing w:before="240" w:after="120"/>
-      </w:pPr>
-      <w:r>
-        <w:rPr>
-          <w:rFonts w:ascii="Times New Roman" w:hAnsi="Times New Roman" w:cs="Times New Roman"/>
-          <w:b/>
-          <w:bCs/>
-          <w:sz w:val="28"/>
-          <w:szCs w:val="28"/>
-        </w:rPr>
-        <w:t xml:space="preserve">iOS va Android platformalarining qiyosiy jadvali</w:t>
-      </w:r>
-    </w:p>
-    <w:p>
-      <w:pPr>
-        <w:spacing w:after="120" w:line="360" w:lineRule="auto"/>
-        <w:jc w:val="both"/>
-      </w:pPr>
-      <w:r>
-        <w:rPr>
-          <w:rFonts w:ascii="Times New Roman" w:hAnsi="Times New Roman" w:cs="Times New Roman"/>
-          <w:sz w:val="28"/>
-          <w:szCs w:val="28"/>
-        </w:rPr>
-        <w:t xml:space="preserve">Quyidagi jadvalda ikki yetakchi mobil operatsion tizimning asosiy texnik va tashkiliy parametrlari taqqoslangan:</w:t>
+        <w:t xml:space="preserve">Quyidagi jadvalda iOS ning asosiy xavfsizlik mexanizmlari va ularning vazifalari umumlashtirilgan:</w:t>
       </w:r>
     </w:p>
     <w:tbl>
@@ -1166,20 +866,19 @@
         <w:tblLook w:val="04A0" w:firstRow="1" w:lastRow="0" w:firstColumn="1" w:lastColumn="0" w:noHBand="0" w:noVBand="1"/>
       </w:tblPr>
       <w:tblGrid>
-        <w:gridCol w:w="3000"/>
-        <w:gridCol w:w="3000"/>
-        <w:gridCol w:w="3000"/>
+        <w:gridCol w:w="3200"/>
+        <w:gridCol w:w="5800"/>
       </w:tblGrid>
       <w:tr>
         <w:tc>
           <w:tcPr>
-            <w:tcW w:w="3000" w:type="dxa"/>
-            <w:shd w:val="clear" w:color="auto" w:fill="008080"/>
-            <w:vAlign w:val="center"/>
-          </w:tcPr>
-          <w:p>
-            <w:pPr>
-              <w:spacing w:after="0" w:line="276" w:lineRule="auto"/>
+            <w:tcW w:w="3200" w:type="dxa"/>
+            <w:shd w:val="clear" w:color="auto" w:fill="007AFF"/>
+            <w:vAlign w:val="center"/>
+          </w:tcPr>
+          <w:p>
+            <w:pPr>
+              <w:spacing w:after="0" w:line="264" w:lineRule="auto"/>
               <w:jc w:val="center"/>
             </w:pPr>
             <w:r>
@@ -1191,19 +890,19 @@
                 <w:sz w:val="24"/>
                 <w:szCs w:val="24"/>
               </w:rPr>
-              <w:t xml:space="preserve">Parametr</w:t>
-            </w:r>
-          </w:p>
-        </w:tc>
-        <w:tc>
-          <w:tcPr>
-            <w:tcW w:w="3000" w:type="dxa"/>
-            <w:shd w:val="clear" w:color="auto" w:fill="008080"/>
-            <w:vAlign w:val="center"/>
-          </w:tcPr>
-          <w:p>
-            <w:pPr>
-              <w:spacing w:after="0" w:line="276" w:lineRule="auto"/>
+              <w:t xml:space="preserve">Mexanizm</w:t>
+            </w:r>
+          </w:p>
+        </w:tc>
+        <w:tc>
+          <w:tcPr>
+            <w:tcW w:w="5800" w:type="dxa"/>
+            <w:shd w:val="clear" w:color="auto" w:fill="007AFF"/>
+            <w:vAlign w:val="center"/>
+          </w:tcPr>
+          <w:p>
+            <w:pPr>
+              <w:spacing w:after="0" w:line="264" w:lineRule="auto"/>
               <w:jc w:val="center"/>
             </w:pPr>
             <w:r>
@@ -1215,19 +914,351 @@
                 <w:sz w:val="24"/>
                 <w:szCs w:val="24"/>
               </w:rPr>
-              <w:t xml:space="preserve">iOS (Apple)</w:t>
-            </w:r>
-          </w:p>
-        </w:tc>
-        <w:tc>
-          <w:tcPr>
-            <w:tcW w:w="3000" w:type="dxa"/>
-            <w:shd w:val="clear" w:color="auto" w:fill="008080"/>
-            <w:vAlign w:val="center"/>
-          </w:tcPr>
-          <w:p>
-            <w:pPr>
-              <w:spacing w:after="0" w:line="276" w:lineRule="auto"/>
+              <w:t xml:space="preserve">Vazifasi</w:t>
+            </w:r>
+          </w:p>
+        </w:tc>
+      </w:tr>
+      <w:tr>
+        <w:tc>
+          <w:tcPr>
+            <w:tcW w:w="3200" w:type="dxa"/>
+            <w:vAlign w:val="center"/>
+          </w:tcPr>
+          <w:p>
+            <w:pPr>
+              <w:spacing w:after="0" w:line="264" w:lineRule="auto"/>
+              <w:jc w:val="center"/>
+            </w:pPr>
+            <w:r>
+              <w:rPr>
+                <w:rFonts w:ascii="Times New Roman" w:hAnsi="Times New Roman" w:cs="Times New Roman"/>
+                <w:sz w:val="24"/>
+                <w:szCs w:val="24"/>
+              </w:rPr>
+              <w:t xml:space="preserve">Secure Boot Chain</w:t>
+            </w:r>
+          </w:p>
+        </w:tc>
+        <w:tc>
+          <w:tcPr>
+            <w:tcW w:w="5800" w:type="dxa"/>
+            <w:vAlign w:val="center"/>
+          </w:tcPr>
+          <w:p>
+            <w:pPr>
+              <w:spacing w:after="0" w:line="264" w:lineRule="auto"/>
+              <w:jc w:val="both"/>
+            </w:pPr>
+            <w:r>
+              <w:rPr>
+                <w:rFonts w:ascii="Times New Roman" w:hAnsi="Times New Roman" w:cs="Times New Roman"/>
+                <w:sz w:val="24"/>
+                <w:szCs w:val="24"/>
+              </w:rPr>
+              <w:t xml:space="preserve">Faqat imzolangan tizim komponentlarining yuklanishini ta'minlaydi</w:t>
+            </w:r>
+          </w:p>
+        </w:tc>
+      </w:tr>
+      <w:tr>
+        <w:tc>
+          <w:tcPr>
+            <w:tcW w:w="3200" w:type="dxa"/>
+            <w:vAlign w:val="center"/>
+          </w:tcPr>
+          <w:p>
+            <w:pPr>
+              <w:spacing w:after="0" w:line="264" w:lineRule="auto"/>
+              <w:jc w:val="center"/>
+            </w:pPr>
+            <w:r>
+              <w:rPr>
+                <w:rFonts w:ascii="Times New Roman" w:hAnsi="Times New Roman" w:cs="Times New Roman"/>
+                <w:sz w:val="24"/>
+                <w:szCs w:val="24"/>
+              </w:rPr>
+              <w:t xml:space="preserve">Secure Enclave</w:t>
+            </w:r>
+          </w:p>
+        </w:tc>
+        <w:tc>
+          <w:tcPr>
+            <w:tcW w:w="5800" w:type="dxa"/>
+            <w:vAlign w:val="center"/>
+          </w:tcPr>
+          <w:p>
+            <w:pPr>
+              <w:spacing w:after="0" w:line="264" w:lineRule="auto"/>
+              <w:jc w:val="both"/>
+            </w:pPr>
+            <w:r>
+              <w:rPr>
+                <w:rFonts w:ascii="Times New Roman" w:hAnsi="Times New Roman" w:cs="Times New Roman"/>
+                <w:sz w:val="24"/>
+                <w:szCs w:val="24"/>
+              </w:rPr>
+              <w:t xml:space="preserve">Biometrik ma'lumotlar va shifrlash kalitlarini izolyatsiyada saqlaydi</w:t>
+            </w:r>
+          </w:p>
+        </w:tc>
+      </w:tr>
+      <w:tr>
+        <w:tc>
+          <w:tcPr>
+            <w:tcW w:w="3200" w:type="dxa"/>
+            <w:vAlign w:val="center"/>
+          </w:tcPr>
+          <w:p>
+            <w:pPr>
+              <w:spacing w:after="0" w:line="264" w:lineRule="auto"/>
+              <w:jc w:val="center"/>
+            </w:pPr>
+            <w:r>
+              <w:rPr>
+                <w:rFonts w:ascii="Times New Roman" w:hAnsi="Times New Roman" w:cs="Times New Roman"/>
+                <w:sz w:val="24"/>
+                <w:szCs w:val="24"/>
+              </w:rPr>
+              <w:t xml:space="preserve">App Sandbox</w:t>
+            </w:r>
+          </w:p>
+        </w:tc>
+        <w:tc>
+          <w:tcPr>
+            <w:tcW w:w="5800" w:type="dxa"/>
+            <w:vAlign w:val="center"/>
+          </w:tcPr>
+          <w:p>
+            <w:pPr>
+              <w:spacing w:after="0" w:line="264" w:lineRule="auto"/>
+              <w:jc w:val="both"/>
+            </w:pPr>
+            <w:r>
+              <w:rPr>
+                <w:rFonts w:ascii="Times New Roman" w:hAnsi="Times New Roman" w:cs="Times New Roman"/>
+                <w:sz w:val="24"/>
+                <w:szCs w:val="24"/>
+              </w:rPr>
+              <w:t xml:space="preserve">Har bir ilovani izolyatsiyalab, ruxsatsiz kirishni cheklaydi</w:t>
+            </w:r>
+          </w:p>
+        </w:tc>
+      </w:tr>
+      <w:tr>
+        <w:tc>
+          <w:tcPr>
+            <w:tcW w:w="3200" w:type="dxa"/>
+            <w:vAlign w:val="center"/>
+          </w:tcPr>
+          <w:p>
+            <w:pPr>
+              <w:spacing w:after="0" w:line="264" w:lineRule="auto"/>
+              <w:jc w:val="center"/>
+            </w:pPr>
+            <w:r>
+              <w:rPr>
+                <w:rFonts w:ascii="Times New Roman" w:hAnsi="Times New Roman" w:cs="Times New Roman"/>
+                <w:sz w:val="24"/>
+                <w:szCs w:val="24"/>
+              </w:rPr>
+              <w:t xml:space="preserve">Code Signing</w:t>
+            </w:r>
+          </w:p>
+        </w:tc>
+        <w:tc>
+          <w:tcPr>
+            <w:tcW w:w="5800" w:type="dxa"/>
+            <w:vAlign w:val="center"/>
+          </w:tcPr>
+          <w:p>
+            <w:pPr>
+              <w:spacing w:after="0" w:line="264" w:lineRule="auto"/>
+              <w:jc w:val="both"/>
+            </w:pPr>
+            <w:r>
+              <w:rPr>
+                <w:rFonts w:ascii="Times New Roman" w:hAnsi="Times New Roman" w:cs="Times New Roman"/>
+                <w:sz w:val="24"/>
+                <w:szCs w:val="24"/>
+              </w:rPr>
+              <w:t xml:space="preserve">Faqat tasdiqlangan kodning bajarilishiga ruxsat beradi</w:t>
+            </w:r>
+          </w:p>
+        </w:tc>
+      </w:tr>
+      <w:tr>
+        <w:tc>
+          <w:tcPr>
+            <w:tcW w:w="3200" w:type="dxa"/>
+            <w:vAlign w:val="center"/>
+          </w:tcPr>
+          <w:p>
+            <w:pPr>
+              <w:spacing w:after="0" w:line="264" w:lineRule="auto"/>
+              <w:jc w:val="center"/>
+            </w:pPr>
+            <w:r>
+              <w:rPr>
+                <w:rFonts w:ascii="Times New Roman" w:hAnsi="Times New Roman" w:cs="Times New Roman"/>
+                <w:sz w:val="24"/>
+                <w:szCs w:val="24"/>
+              </w:rPr>
+              <w:t xml:space="preserve">Data Protection</w:t>
+            </w:r>
+          </w:p>
+        </w:tc>
+        <w:tc>
+          <w:tcPr>
+            <w:tcW w:w="5800" w:type="dxa"/>
+            <w:vAlign w:val="center"/>
+          </w:tcPr>
+          <w:p>
+            <w:pPr>
+              <w:spacing w:after="0" w:line="264" w:lineRule="auto"/>
+              <w:jc w:val="both"/>
+            </w:pPr>
+            <w:r>
+              <w:rPr>
+                <w:rFonts w:ascii="Times New Roman" w:hAnsi="Times New Roman" w:cs="Times New Roman"/>
+                <w:sz w:val="24"/>
+                <w:szCs w:val="24"/>
+              </w:rPr>
+              <w:t xml:space="preserve">Fayllarni qurilma bloklangan holatda apparat darajasida shifrlaydi</w:t>
+            </w:r>
+          </w:p>
+        </w:tc>
+      </w:tr>
+      <w:p/>
+    </w:tbl>
+    <w:p>
+      <w:pPr>
+        <w:spacing w:before="60" w:after="200"/>
+        <w:jc w:val="center"/>
+      </w:pPr>
+      <w:r>
+        <w:rPr>
+          <w:rFonts w:ascii="Times New Roman" w:hAnsi="Times New Roman" w:cs="Times New Roman"/>
+          <w:i/>
+          <w:iCs/>
+          <w:color w:val="555555"/>
+          <w:sz w:val="22"/>
+          <w:szCs w:val="22"/>
+        </w:rPr>
+        <w:t xml:space="preserve">1-jadval. iOS ning asosiy xavfsizlik mexanizmlari</w:t>
+      </w:r>
+    </w:p>
+    <w:p>
+      <w:r>
+        <w:br w:type="page"/>
+      </w:r>
+    </w:p>
+    <w:p>
+      <w:pPr>
+        <w:pStyle w:val="2"/>
+        <w:spacing w:before="240" w:after="120"/>
+      </w:pPr>
+      <w:r>
+        <w:rPr>
+          <w:rFonts w:ascii="Times New Roman" w:hAnsi="Times New Roman" w:cs="Times New Roman"/>
+          <w:b/>
+          <w:bCs/>
+          <w:sz w:val="28"/>
+          <w:szCs w:val="28"/>
+        </w:rPr>
+        <w:t xml:space="preserve">2. iOS va Android platformalarining dasturchi nuqtai nazaridan farqlari</w:t>
+      </w:r>
+    </w:p>
+    <w:p>
+      <w:pPr>
+        <w:spacing w:after="120" w:line="360" w:lineRule="auto"/>
+        <w:jc w:val="both"/>
+        <w:ind w:firstLine="709"/>
+      </w:pPr>
+      <w:r>
+        <w:rPr>
+          <w:rFonts w:ascii="Times New Roman" w:hAnsi="Times New Roman" w:cs="Times New Roman"/>
+          <w:sz w:val="28"/>
+          <w:szCs w:val="28"/>
+        </w:rPr>
+        <w:t xml:space="preserve">Garchi ikkala platforma ham mobil ilovalar yaratishga mo'ljallangan bo'lsa-da, ularning falsafasi va dasturlash jarayoni sezilarli darajada farq qiladi. Dasturchi loyihani boshlashdan oldin ushbu farqlarni hisobga olishi zarur.</w:t>
+      </w:r>
+    </w:p>
+    <w:p>
+      <w:pPr>
+        <w:spacing w:after="120" w:line="360" w:lineRule="auto"/>
+        <w:jc w:val="both"/>
+        <w:ind w:firstLine="709"/>
+      </w:pPr>
+      <w:r>
+        <w:rPr>
+          <w:rFonts w:ascii="Times New Roman" w:hAnsi="Times New Roman" w:cs="Times New Roman"/>
+          <w:sz w:val="28"/>
+          <w:szCs w:val="28"/>
+        </w:rPr>
+        <w:t xml:space="preserve">Dasturlash tillari va muhiti: iOS uchun ilovalar asosan Swift (va eski Objective-C) tilida, faqat Apple ning macOS operatsion tizimida ishlovchi Xcode muhitida yoziladi. Android uchun esa Kotlin va Java tillari hamda Android Studio ishlatilib, ishlab chiqishni Windows, macOS yoki Linux da olib borish mumkin.</w:t>
+      </w:r>
+    </w:p>
+    <w:p>
+      <w:pPr>
+        <w:spacing w:after="120" w:line="360" w:lineRule="auto"/>
+        <w:jc w:val="both"/>
+        <w:ind w:firstLine="709"/>
+      </w:pPr>
+      <w:r>
+        <w:rPr>
+          <w:rFonts w:ascii="Times New Roman" w:hAnsi="Times New Roman" w:cs="Times New Roman"/>
+          <w:sz w:val="28"/>
+          <w:szCs w:val="28"/>
+        </w:rPr>
+        <w:t xml:space="preserve">Ekotizimning yopiqligi: iOS — yopiq ('walled garden') ekotizim bo'lib, Apple apparat va dasturiy ta'minotni to'liq nazorat qiladi. Qurilmalar turi cheklangani uchun dasturchi kamroq modellarga moslashtirish ishini bajaradi. Android esa ochiq tizim bo'lib, yuzlab ishlab chiqaruvchilarning turli ekran o'lchami va apparatiga ega qurilmalarida ishlaydi — bu 'fragmentatsiya' muammosini keltirib chiqaradi va testlashni murakkablashtiradi.</w:t>
+      </w:r>
+    </w:p>
+    <w:p>
+      <w:pPr>
+        <w:spacing w:after="120" w:line="360" w:lineRule="auto"/>
+        <w:jc w:val="both"/>
+        <w:ind w:firstLine="709"/>
+      </w:pPr>
+      <w:r>
+        <w:rPr>
+          <w:rFonts w:ascii="Times New Roman" w:hAnsi="Times New Roman" w:cs="Times New Roman"/>
+          <w:sz w:val="28"/>
+          <w:szCs w:val="28"/>
+        </w:rPr>
+        <w:t xml:space="preserve">Ilovalarni tarqatish va daromad: iOS ilovalari faqat rasmiy App Store orqali o'rnatiladi. Android da esa APK fayllarini boshqa manbalardan ham o'rnatish (sideloading) mumkin. Statistik jihatdan iOS foydalanuvchilari ilovalarga ko'proq pul sarflashga moyil. Quyidagi jadval ikki platformani dasturchi nuqtai nazaridan taqqoslaydi:</w:t>
+      </w:r>
+    </w:p>
+    <w:tbl>
+      <w:tblPr>
+        <w:tblStyle w:val="a3"/>
+        <w:tblW w:w="0" w:type="auto"/>
+        <w:jc w:val="center"/>
+        <w:tblBorders>
+          <w:top w:val="single" w:sz="6" w:space="0" w:color="808080"/>
+          <w:left w:val="single" w:sz="6" w:space="0" w:color="808080"/>
+          <w:bottom w:val="single" w:sz="6" w:space="0" w:color="808080"/>
+          <w:right w:val="single" w:sz="6" w:space="0" w:color="808080"/>
+          <w:insideH w:val="single" w:sz="6" w:space="0" w:color="808080"/>
+          <w:insideV w:val="single" w:sz="6" w:space="0" w:color="808080"/>
+        </w:tblBorders>
+        <w:tblLook w:val="04A0" w:firstRow="1" w:lastRow="0" w:firstColumn="1" w:lastColumn="0" w:noHBand="0" w:noVBand="1"/>
+      </w:tblPr>
+      <w:tblGrid>
+        <w:gridCol w:w="2800"/>
+        <w:gridCol w:w="3100"/>
+        <w:gridCol w:w="3100"/>
+      </w:tblGrid>
+      <w:tr>
+        <w:tc>
+          <w:tcPr>
+            <w:tcW w:w="2800" w:type="dxa"/>
+            <w:shd w:val="clear" w:color="auto" w:fill="007AFF"/>
+            <w:vAlign w:val="center"/>
+          </w:tcPr>
+          <w:p>
+            <w:pPr>
+              <w:spacing w:after="0" w:line="264" w:lineRule="auto"/>
               <w:jc w:val="center"/>
             </w:pPr>
             <w:r>
@@ -1239,6 +1270,54 @@
                 <w:sz w:val="24"/>
                 <w:szCs w:val="24"/>
               </w:rPr>
+              <w:t xml:space="preserve">Mezon</w:t>
+            </w:r>
+          </w:p>
+        </w:tc>
+        <w:tc>
+          <w:tcPr>
+            <w:tcW w:w="3100" w:type="dxa"/>
+            <w:shd w:val="clear" w:color="auto" w:fill="007AFF"/>
+            <w:vAlign w:val="center"/>
+          </w:tcPr>
+          <w:p>
+            <w:pPr>
+              <w:spacing w:after="0" w:line="264" w:lineRule="auto"/>
+              <w:jc w:val="center"/>
+            </w:pPr>
+            <w:r>
+              <w:rPr>
+                <w:rFonts w:ascii="Times New Roman" w:hAnsi="Times New Roman" w:cs="Times New Roman"/>
+                <w:b/>
+                <w:bCs/>
+                <w:color w:val="FFFFFF"/>
+                <w:sz w:val="24"/>
+                <w:szCs w:val="24"/>
+              </w:rPr>
+              <w:t xml:space="preserve">iOS (Apple)</w:t>
+            </w:r>
+          </w:p>
+        </w:tc>
+        <w:tc>
+          <w:tcPr>
+            <w:tcW w:w="3100" w:type="dxa"/>
+            <w:shd w:val="clear" w:color="auto" w:fill="007AFF"/>
+            <w:vAlign w:val="center"/>
+          </w:tcPr>
+          <w:p>
+            <w:pPr>
+              <w:spacing w:after="0" w:line="264" w:lineRule="auto"/>
+              <w:jc w:val="center"/>
+            </w:pPr>
+            <w:r>
+              <w:rPr>
+                <w:rFonts w:ascii="Times New Roman" w:hAnsi="Times New Roman" w:cs="Times New Roman"/>
+                <w:b/>
+                <w:bCs/>
+                <w:color w:val="FFFFFF"/>
+                <w:sz w:val="24"/>
+                <w:szCs w:val="24"/>
+              </w:rPr>
               <w:t xml:space="preserve">Android (Google)</w:t>
             </w:r>
           </w:p>
@@ -1247,12 +1326,12 @@
       <w:tr>
         <w:tc>
           <w:tcPr>
-            <w:tcW w:w="3000" w:type="dxa"/>
-            <w:vAlign w:val="center"/>
-          </w:tcPr>
-          <w:p>
-            <w:pPr>
-              <w:spacing w:after="0" w:line="276" w:lineRule="auto"/>
+            <w:tcW w:w="2800" w:type="dxa"/>
+            <w:vAlign w:val="center"/>
+          </w:tcPr>
+          <w:p>
+            <w:pPr>
+              <w:spacing w:after="0" w:line="264" w:lineRule="auto"/>
               <w:jc w:val="center"/>
             </w:pPr>
             <w:r>
@@ -1261,18 +1340,18 @@
                 <w:sz w:val="24"/>
                 <w:szCs w:val="24"/>
               </w:rPr>
-              <w:t xml:space="preserve">Ishlab chiquvchi</w:t>
-            </w:r>
-          </w:p>
-        </w:tc>
-        <w:tc>
-          <w:tcPr>
-            <w:tcW w:w="3000" w:type="dxa"/>
-            <w:vAlign w:val="center"/>
-          </w:tcPr>
-          <w:p>
-            <w:pPr>
-              <w:spacing w:after="0" w:line="276" w:lineRule="auto"/>
+              <w:t xml:space="preserve">Dasturlash tili</w:t>
+            </w:r>
+          </w:p>
+        </w:tc>
+        <w:tc>
+          <w:tcPr>
+            <w:tcW w:w="3100" w:type="dxa"/>
+            <w:vAlign w:val="center"/>
+          </w:tcPr>
+          <w:p>
+            <w:pPr>
+              <w:spacing w:after="0" w:line="264" w:lineRule="auto"/>
               <w:jc w:val="center"/>
             </w:pPr>
             <w:r>
@@ -1281,18 +1360,18 @@
                 <w:sz w:val="24"/>
                 <w:szCs w:val="24"/>
               </w:rPr>
-              <w:t xml:space="preserve">Apple Inc.</w:t>
-            </w:r>
-          </w:p>
-        </w:tc>
-        <w:tc>
-          <w:tcPr>
-            <w:tcW w:w="3000" w:type="dxa"/>
-            <w:vAlign w:val="center"/>
-          </w:tcPr>
-          <w:p>
-            <w:pPr>
-              <w:spacing w:after="0" w:line="276" w:lineRule="auto"/>
+              <w:t xml:space="preserve">Swift, Objective-C</w:t>
+            </w:r>
+          </w:p>
+        </w:tc>
+        <w:tc>
+          <w:tcPr>
+            <w:tcW w:w="3100" w:type="dxa"/>
+            <w:vAlign w:val="center"/>
+          </w:tcPr>
+          <w:p>
+            <w:pPr>
+              <w:spacing w:after="0" w:line="264" w:lineRule="auto"/>
               <w:jc w:val="center"/>
             </w:pPr>
             <w:r>
@@ -1301,7 +1380,7 @@
                 <w:sz w:val="24"/>
                 <w:szCs w:val="24"/>
               </w:rPr>
-              <w:t xml:space="preserve">Google / Open Handset Alliance</w:t>
+              <w:t xml:space="preserve">Kotlin, Java</w:t>
             </w:r>
           </w:p>
         </w:tc>
@@ -1309,12 +1388,12 @@
       <w:tr>
         <w:tc>
           <w:tcPr>
-            <w:tcW w:w="3000" w:type="dxa"/>
-            <w:vAlign w:val="center"/>
-          </w:tcPr>
-          <w:p>
-            <w:pPr>
-              <w:spacing w:after="0" w:line="276" w:lineRule="auto"/>
+            <w:tcW w:w="2800" w:type="dxa"/>
+            <w:vAlign w:val="center"/>
+          </w:tcPr>
+          <w:p>
+            <w:pPr>
+              <w:spacing w:after="0" w:line="264" w:lineRule="auto"/>
               <w:jc w:val="center"/>
             </w:pPr>
             <w:r>
@@ -1323,18 +1402,18 @@
                 <w:sz w:val="24"/>
                 <w:szCs w:val="24"/>
               </w:rPr>
-              <w:t xml:space="preserve">Asosiy dasturlash tili</w:t>
-            </w:r>
-          </w:p>
-        </w:tc>
-        <w:tc>
-          <w:tcPr>
-            <w:tcW w:w="3000" w:type="dxa"/>
-            <w:vAlign w:val="center"/>
-          </w:tcPr>
-          <w:p>
-            <w:pPr>
-              <w:spacing w:after="0" w:line="276" w:lineRule="auto"/>
+              <w:t xml:space="preserve">Muhit (IDE)</w:t>
+            </w:r>
+          </w:p>
+        </w:tc>
+        <w:tc>
+          <w:tcPr>
+            <w:tcW w:w="3100" w:type="dxa"/>
+            <w:vAlign w:val="center"/>
+          </w:tcPr>
+          <w:p>
+            <w:pPr>
+              <w:spacing w:after="0" w:line="264" w:lineRule="auto"/>
               <w:jc w:val="center"/>
             </w:pPr>
             <w:r>
@@ -1343,18 +1422,18 @@
                 <w:sz w:val="24"/>
                 <w:szCs w:val="24"/>
               </w:rPr>
-              <w:t xml:space="preserve">Swift, Objective-C</w:t>
-            </w:r>
-          </w:p>
-        </w:tc>
-        <w:tc>
-          <w:tcPr>
-            <w:tcW w:w="3000" w:type="dxa"/>
-            <w:vAlign w:val="center"/>
-          </w:tcPr>
-          <w:p>
-            <w:pPr>
-              <w:spacing w:after="0" w:line="276" w:lineRule="auto"/>
+              <w:t xml:space="preserve">Xcode (faqat macOS)</w:t>
+            </w:r>
+          </w:p>
+        </w:tc>
+        <w:tc>
+          <w:tcPr>
+            <w:tcW w:w="3100" w:type="dxa"/>
+            <w:vAlign w:val="center"/>
+          </w:tcPr>
+          <w:p>
+            <w:pPr>
+              <w:spacing w:after="0" w:line="264" w:lineRule="auto"/>
               <w:jc w:val="center"/>
             </w:pPr>
             <w:r>
@@ -1363,7 +1442,7 @@
                 <w:sz w:val="24"/>
                 <w:szCs w:val="24"/>
               </w:rPr>
-              <w:t xml:space="preserve">Kotlin, Java</w:t>
+              <w:t xml:space="preserve">Android Studio (kross-platforma)</w:t>
             </w:r>
           </w:p>
         </w:tc>
@@ -1371,12 +1450,12 @@
       <w:tr>
         <w:tc>
           <w:tcPr>
-            <w:tcW w:w="3000" w:type="dxa"/>
-            <w:vAlign w:val="center"/>
-          </w:tcPr>
-          <w:p>
-            <w:pPr>
-              <w:spacing w:after="0" w:line="276" w:lineRule="auto"/>
+            <w:tcW w:w="2800" w:type="dxa"/>
+            <w:vAlign w:val="center"/>
+          </w:tcPr>
+          <w:p>
+            <w:pPr>
+              <w:spacing w:after="0" w:line="264" w:lineRule="auto"/>
               <w:jc w:val="center"/>
             </w:pPr>
             <w:r>
@@ -1385,18 +1464,18 @@
                 <w:sz w:val="24"/>
                 <w:szCs w:val="24"/>
               </w:rPr>
-              <w:t xml:space="preserve">Ishlab chiqish muhiti</w:t>
-            </w:r>
-          </w:p>
-        </w:tc>
-        <w:tc>
-          <w:tcPr>
-            <w:tcW w:w="3000" w:type="dxa"/>
-            <w:vAlign w:val="center"/>
-          </w:tcPr>
-          <w:p>
-            <w:pPr>
-              <w:spacing w:after="0" w:line="276" w:lineRule="auto"/>
+              <w:t xml:space="preserve">Ekotizim</w:t>
+            </w:r>
+          </w:p>
+        </w:tc>
+        <w:tc>
+          <w:tcPr>
+            <w:tcW w:w="3100" w:type="dxa"/>
+            <w:vAlign w:val="center"/>
+          </w:tcPr>
+          <w:p>
+            <w:pPr>
+              <w:spacing w:after="0" w:line="264" w:lineRule="auto"/>
               <w:jc w:val="center"/>
             </w:pPr>
             <w:r>
@@ -1405,18 +1484,18 @@
                 <w:sz w:val="24"/>
                 <w:szCs w:val="24"/>
               </w:rPr>
-              <w:t xml:space="preserve">Xcode (faqat macOS)</w:t>
-            </w:r>
-          </w:p>
-        </w:tc>
-        <w:tc>
-          <w:tcPr>
-            <w:tcW w:w="3000" w:type="dxa"/>
-            <w:vAlign w:val="center"/>
-          </w:tcPr>
-          <w:p>
-            <w:pPr>
-              <w:spacing w:after="0" w:line="276" w:lineRule="auto"/>
+              <w:t xml:space="preserve">Yopiq (walled garden)</w:t>
+            </w:r>
+          </w:p>
+        </w:tc>
+        <w:tc>
+          <w:tcPr>
+            <w:tcW w:w="3100" w:type="dxa"/>
+            <w:vAlign w:val="center"/>
+          </w:tcPr>
+          <w:p>
+            <w:pPr>
+              <w:spacing w:after="0" w:line="264" w:lineRule="auto"/>
               <w:jc w:val="center"/>
             </w:pPr>
             <w:r>
@@ -1425,7 +1504,7 @@
                 <w:sz w:val="24"/>
                 <w:szCs w:val="24"/>
               </w:rPr>
-              <w:t xml:space="preserve">Android Studio (kross-platforma)</w:t>
+              <w:t xml:space="preserve">Ochiq (open source)</w:t>
             </w:r>
           </w:p>
         </w:tc>
@@ -1433,12 +1512,12 @@
       <w:tr>
         <w:tc>
           <w:tcPr>
-            <w:tcW w:w="3000" w:type="dxa"/>
-            <w:vAlign w:val="center"/>
-          </w:tcPr>
-          <w:p>
-            <w:pPr>
-              <w:spacing w:after="0" w:line="276" w:lineRule="auto"/>
+            <w:tcW w:w="2800" w:type="dxa"/>
+            <w:vAlign w:val="center"/>
+          </w:tcPr>
+          <w:p>
+            <w:pPr>
+              <w:spacing w:after="0" w:line="264" w:lineRule="auto"/>
               <w:jc w:val="center"/>
             </w:pPr>
             <w:r>
@@ -1447,18 +1526,18 @@
                 <w:sz w:val="24"/>
                 <w:szCs w:val="24"/>
               </w:rPr>
-              <w:t xml:space="preserve">Ekotizim turi</w:t>
-            </w:r>
-          </w:p>
-        </w:tc>
-        <w:tc>
-          <w:tcPr>
-            <w:tcW w:w="3000" w:type="dxa"/>
-            <w:vAlign w:val="center"/>
-          </w:tcPr>
-          <w:p>
-            <w:pPr>
-              <w:spacing w:after="0" w:line="276" w:lineRule="auto"/>
+              <w:t xml:space="preserve">Ilova manbasi</w:t>
+            </w:r>
+          </w:p>
+        </w:tc>
+        <w:tc>
+          <w:tcPr>
+            <w:tcW w:w="3100" w:type="dxa"/>
+            <w:vAlign w:val="center"/>
+          </w:tcPr>
+          <w:p>
+            <w:pPr>
+              <w:spacing w:after="0" w:line="264" w:lineRule="auto"/>
               <w:jc w:val="center"/>
             </w:pPr>
             <w:r>
@@ -1467,18 +1546,18 @@
                 <w:sz w:val="24"/>
                 <w:szCs w:val="24"/>
               </w:rPr>
-              <w:t xml:space="preserve">Yopiq (walled garden)</w:t>
-            </w:r>
-          </w:p>
-        </w:tc>
-        <w:tc>
-          <w:tcPr>
-            <w:tcW w:w="3000" w:type="dxa"/>
-            <w:vAlign w:val="center"/>
-          </w:tcPr>
-          <w:p>
-            <w:pPr>
-              <w:spacing w:after="0" w:line="276" w:lineRule="auto"/>
+              <w:t xml:space="preserve">Faqat App Store</w:t>
+            </w:r>
+          </w:p>
+        </w:tc>
+        <w:tc>
+          <w:tcPr>
+            <w:tcW w:w="3100" w:type="dxa"/>
+            <w:vAlign w:val="center"/>
+          </w:tcPr>
+          <w:p>
+            <w:pPr>
+              <w:spacing w:after="0" w:line="264" w:lineRule="auto"/>
               <w:jc w:val="center"/>
             </w:pPr>
             <w:r>
@@ -1487,7 +1566,7 @@
                 <w:sz w:val="24"/>
                 <w:szCs w:val="24"/>
               </w:rPr>
-              <w:t xml:space="preserve">Ochiq (open source)</w:t>
+              <w:t xml:space="preserve">Play Store + sideloading</w:t>
             </w:r>
           </w:p>
         </w:tc>
@@ -1495,12 +1574,12 @@
       <w:tr>
         <w:tc>
           <w:tcPr>
-            <w:tcW w:w="3000" w:type="dxa"/>
-            <w:vAlign w:val="center"/>
-          </w:tcPr>
-          <w:p>
-            <w:pPr>
-              <w:spacing w:after="0" w:line="276" w:lineRule="auto"/>
+            <w:tcW w:w="2800" w:type="dxa"/>
+            <w:vAlign w:val="center"/>
+          </w:tcPr>
+          <w:p>
+            <w:pPr>
+              <w:spacing w:after="0" w:line="264" w:lineRule="auto"/>
               <w:jc w:val="center"/>
             </w:pPr>
             <w:r>
@@ -1509,18 +1588,18 @@
                 <w:sz w:val="24"/>
                 <w:szCs w:val="24"/>
               </w:rPr>
-              <w:t xml:space="preserve">Ilova manbasi</w:t>
-            </w:r>
-          </w:p>
-        </w:tc>
-        <w:tc>
-          <w:tcPr>
-            <w:tcW w:w="3000" w:type="dxa"/>
-            <w:vAlign w:val="center"/>
-          </w:tcPr>
-          <w:p>
-            <w:pPr>
-              <w:spacing w:after="0" w:line="276" w:lineRule="auto"/>
+              <w:t xml:space="preserve">Apparat xilma-xilligi</w:t>
+            </w:r>
+          </w:p>
+        </w:tc>
+        <w:tc>
+          <w:tcPr>
+            <w:tcW w:w="3100" w:type="dxa"/>
+            <w:vAlign w:val="center"/>
+          </w:tcPr>
+          <w:p>
+            <w:pPr>
+              <w:spacing w:after="0" w:line="264" w:lineRule="auto"/>
               <w:jc w:val="center"/>
             </w:pPr>
             <w:r>
@@ -1529,18 +1608,18 @@
                 <w:sz w:val="24"/>
                 <w:szCs w:val="24"/>
               </w:rPr>
-              <w:t xml:space="preserve">Faqat App Store</w:t>
-            </w:r>
-          </w:p>
-        </w:tc>
-        <w:tc>
-          <w:tcPr>
-            <w:tcW w:w="3000" w:type="dxa"/>
-            <w:vAlign w:val="center"/>
-          </w:tcPr>
-          <w:p>
-            <w:pPr>
-              <w:spacing w:after="0" w:line="276" w:lineRule="auto"/>
+              <w:t xml:space="preserve">Cheklangan (Apple)</w:t>
+            </w:r>
+          </w:p>
+        </w:tc>
+        <w:tc>
+          <w:tcPr>
+            <w:tcW w:w="3100" w:type="dxa"/>
+            <w:vAlign w:val="center"/>
+          </w:tcPr>
+          <w:p>
+            <w:pPr>
+              <w:spacing w:after="0" w:line="264" w:lineRule="auto"/>
               <w:jc w:val="center"/>
             </w:pPr>
             <w:r>
@@ -1549,7 +1628,7 @@
                 <w:sz w:val="24"/>
                 <w:szCs w:val="24"/>
               </w:rPr>
-              <w:t xml:space="preserve">Play Store + sideloading</w:t>
+              <w:t xml:space="preserve">Juda yuqori (fragmentatsiya)</w:t>
             </w:r>
           </w:p>
         </w:tc>
@@ -1557,12 +1636,12 @@
       <w:tr>
         <w:tc>
           <w:tcPr>
-            <w:tcW w:w="3000" w:type="dxa"/>
-            <w:vAlign w:val="center"/>
-          </w:tcPr>
-          <w:p>
-            <w:pPr>
-              <w:spacing w:after="0" w:line="276" w:lineRule="auto"/>
+            <w:tcW w:w="2800" w:type="dxa"/>
+            <w:vAlign w:val="center"/>
+          </w:tcPr>
+          <w:p>
+            <w:pPr>
+              <w:spacing w:after="0" w:line="264" w:lineRule="auto"/>
               <w:jc w:val="center"/>
             </w:pPr>
             <w:r>
@@ -1571,18 +1650,18 @@
                 <w:sz w:val="24"/>
                 <w:szCs w:val="24"/>
               </w:rPr>
-              <w:t xml:space="preserve">Apparat</w:t>
-            </w:r>
-          </w:p>
-        </w:tc>
-        <w:tc>
-          <w:tcPr>
-            <w:tcW w:w="3000" w:type="dxa"/>
-            <w:vAlign w:val="center"/>
-          </w:tcPr>
-          <w:p>
-            <w:pPr>
-              <w:spacing w:after="0" w:line="276" w:lineRule="auto"/>
+              <w:t xml:space="preserve">Yangilanish tarqalishi</w:t>
+            </w:r>
+          </w:p>
+        </w:tc>
+        <w:tc>
+          <w:tcPr>
+            <w:tcW w:w="3100" w:type="dxa"/>
+            <w:vAlign w:val="center"/>
+          </w:tcPr>
+          <w:p>
+            <w:pPr>
+              <w:spacing w:after="0" w:line="264" w:lineRule="auto"/>
               <w:jc w:val="center"/>
             </w:pPr>
             <w:r>
@@ -1591,18 +1670,18 @@
                 <w:sz w:val="24"/>
                 <w:szCs w:val="24"/>
               </w:rPr>
-              <w:t xml:space="preserve">Faqat Apple qurilmalari</w:t>
-            </w:r>
-          </w:p>
-        </w:tc>
-        <w:tc>
-          <w:tcPr>
-            <w:tcW w:w="3000" w:type="dxa"/>
-            <w:vAlign w:val="center"/>
-          </w:tcPr>
-          <w:p>
-            <w:pPr>
-              <w:spacing w:after="0" w:line="276" w:lineRule="auto"/>
+              <w:t xml:space="preserve">Tez, barcha qurilmaga</w:t>
+            </w:r>
+          </w:p>
+        </w:tc>
+        <w:tc>
+          <w:tcPr>
+            <w:tcW w:w="3100" w:type="dxa"/>
+            <w:vAlign w:val="center"/>
+          </w:tcPr>
+          <w:p>
+            <w:pPr>
+              <w:spacing w:after="0" w:line="264" w:lineRule="auto"/>
               <w:jc w:val="center"/>
             </w:pPr>
             <w:r>
@@ -1611,7 +1690,7 @@
                 <w:sz w:val="24"/>
                 <w:szCs w:val="24"/>
               </w:rPr>
-              <w:t xml:space="preserve">Ko'plab ishlab chiqaruvchilar</w:t>
+              <w:t xml:space="preserve">Sekin, ishlab chiquvchiga bog'liq</w:t>
             </w:r>
           </w:p>
         </w:tc>
@@ -1619,12 +1698,12 @@
       <w:tr>
         <w:tc>
           <w:tcPr>
-            <w:tcW w:w="3000" w:type="dxa"/>
-            <w:vAlign w:val="center"/>
-          </w:tcPr>
-          <w:p>
-            <w:pPr>
-              <w:spacing w:after="0" w:line="276" w:lineRule="auto"/>
+            <w:tcW w:w="2800" w:type="dxa"/>
+            <w:vAlign w:val="center"/>
+          </w:tcPr>
+          <w:p>
+            <w:pPr>
+              <w:spacing w:after="0" w:line="264" w:lineRule="auto"/>
               <w:jc w:val="center"/>
             </w:pPr>
             <w:r>
@@ -1633,18 +1712,18 @@
                 <w:sz w:val="24"/>
                 <w:szCs w:val="24"/>
               </w:rPr>
-              <w:t xml:space="preserve">Yangilanish tarqalishi</w:t>
-            </w:r>
-          </w:p>
-        </w:tc>
-        <w:tc>
-          <w:tcPr>
-            <w:tcW w:w="3000" w:type="dxa"/>
-            <w:vAlign w:val="center"/>
-          </w:tcPr>
-          <w:p>
-            <w:pPr>
-              <w:spacing w:after="0" w:line="276" w:lineRule="auto"/>
+              <w:t xml:space="preserve">Dasturchi daromadi</w:t>
+            </w:r>
+          </w:p>
+        </w:tc>
+        <w:tc>
+          <w:tcPr>
+            <w:tcW w:w="3100" w:type="dxa"/>
+            <w:vAlign w:val="center"/>
+          </w:tcPr>
+          <w:p>
+            <w:pPr>
+              <w:spacing w:after="0" w:line="264" w:lineRule="auto"/>
               <w:jc w:val="center"/>
             </w:pPr>
             <w:r>
@@ -1653,18 +1732,18 @@
                 <w:sz w:val="24"/>
                 <w:szCs w:val="24"/>
               </w:rPr>
-              <w:t xml:space="preserve">Bir vaqtda, barcha qurilmaga</w:t>
-            </w:r>
-          </w:p>
-        </w:tc>
-        <w:tc>
-          <w:tcPr>
-            <w:tcW w:w="3000" w:type="dxa"/>
-            <w:vAlign w:val="center"/>
-          </w:tcPr>
-          <w:p>
-            <w:pPr>
-              <w:spacing w:after="0" w:line="276" w:lineRule="auto"/>
+              <w:t xml:space="preserve">Odatda yuqoriroq</w:t>
+            </w:r>
+          </w:p>
+        </w:tc>
+        <w:tc>
+          <w:tcPr>
+            <w:tcW w:w="3100" w:type="dxa"/>
+            <w:vAlign w:val="center"/>
+          </w:tcPr>
+          <w:p>
+            <w:pPr>
+              <w:spacing w:after="0" w:line="264" w:lineRule="auto"/>
               <w:jc w:val="center"/>
             </w:pPr>
             <w:r>
@@ -1673,12 +1752,1443 @@
                 <w:sz w:val="24"/>
                 <w:szCs w:val="24"/>
               </w:rPr>
-              <w:t xml:space="preserve">Sekin, fragmentatsiyali</w:t>
+              <w:t xml:space="preserve">Pastroq, lekin keng auditoriya</w:t>
             </w:r>
           </w:p>
         </w:tc>
       </w:tr>
+      <w:p/>
     </w:tbl>
+    <w:p>
+      <w:pPr>
+        <w:spacing w:before="60" w:after="200"/>
+        <w:jc w:val="center"/>
+      </w:pPr>
+      <w:r>
+        <w:rPr>
+          <w:rFonts w:ascii="Times New Roman" w:hAnsi="Times New Roman" w:cs="Times New Roman"/>
+          <w:i/>
+          <w:iCs/>
+          <w:color w:val="555555"/>
+          <w:sz w:val="22"/>
+          <w:szCs w:val="22"/>
+        </w:rPr>
+        <w:t xml:space="preserve">2-jadval. iOS va Android platformalarining qiyosiy tahlili</w:t>
+      </w:r>
+    </w:p>
+    <w:p>
+      <w:pPr>
+        <w:spacing w:after="120" w:line="360" w:lineRule="auto"/>
+        <w:jc w:val="both"/>
+        <w:ind w:firstLine="709"/>
+      </w:pPr>
+      <w:r>
+        <w:rPr>
+          <w:rFonts w:ascii="Times New Roman" w:hAnsi="Times New Roman" w:cs="Times New Roman"/>
+          <w:sz w:val="28"/>
+          <w:szCs w:val="28"/>
+        </w:rPr>
+        <w:t xml:space="preserve">Xulosa qilib aytganda, agar loyihaning maqsadi yuqori daromad va premium auditoriya bo'lsa, iOS ustun keladi; agar maksimal qamrov va arzon ishlab chiqish muhim bo'lsa, Android afzalroqdir.</w:t>
+      </w:r>
+    </w:p>
+    <w:p>
+      <w:r>
+        <w:br w:type="page"/>
+      </w:r>
+    </w:p>
+    <w:p>
+      <w:pPr>
+        <w:pStyle w:val="2"/>
+        <w:spacing w:before="240" w:after="120"/>
+      </w:pPr>
+      <w:r>
+        <w:rPr>
+          <w:rFonts w:ascii="Times New Roman" w:hAnsi="Times New Roman" w:cs="Times New Roman"/>
+          <w:b/>
+          <w:bCs/>
+          <w:sz w:val="28"/>
+          <w:szCs w:val="28"/>
+        </w:rPr>
+        <w:t xml:space="preserve">3. iOS App Store modeli va ilovalarni tekshirish jarayoni</w:t>
+      </w:r>
+    </w:p>
+    <w:p>
+      <w:pPr>
+        <w:spacing w:after="120" w:line="360" w:lineRule="auto"/>
+        <w:jc w:val="both"/>
+        <w:ind w:firstLine="709"/>
+      </w:pPr>
+      <w:r>
+        <w:rPr>
+          <w:rFonts w:ascii="Times New Roman" w:hAnsi="Times New Roman" w:cs="Times New Roman"/>
+          <w:sz w:val="28"/>
+          <w:szCs w:val="28"/>
+        </w:rPr>
+        <w:t xml:space="preserve">App Store — bu 2008-yilda ishga tushirilgan, iOS ilovalarini tarqatishning yagona rasmiy markazlashtirilgan platformasidir. Apple ning bu boradagi siyosati qat'iy moderatsiyaga asoslanadi va asosiy maqsadi foydalanuvchi xavfsizligi hamda ilovalar sifatini ta'minlashdir. Quyidagi grafik App Store dagi ilovalar sonining yillar davomidagi o'sishini ko'rsatadi:</w:t>
+      </w:r>
+    </w:p>
+    <w:p>
+      <w:pPr>
+        <w:spacing w:before="120" w:after="40"/>
+        <w:jc w:val="center"/>
+      </w:pPr>
+      <w:r>
+        <w:drawing>
+          <wp:inline distT="0" distB="0" distL="0" distR="0">
+            <wp:extent cx="5580000" cy="2901600"/>
+            <wp:effectExtent l="0" t="0" r="0" b="0"/>
+            <wp:docPr id="104" name="app_growth"/>
+            <wp:cNvGraphicFramePr>
+              <a:graphicFrameLocks xmlns:a="http://schemas.openxmlformats.org/drawingml/2006/main" noChangeAspect="1"/>
+            </wp:cNvGraphicFramePr>
+            <a:graphic xmlns:a="http://schemas.openxmlformats.org/drawingml/2006/main">
+              <a:graphicData uri="http://schemas.openxmlformats.org/drawingml/2006/picture">
+                <pic:pic xmlns:pic="http://schemas.openxmlformats.org/drawingml/2006/picture">
+                  <pic:nvPicPr>
+                    <pic:cNvPr id="104" name="app_growth"/>
+                    <pic:cNvPicPr/>
+                  </pic:nvPicPr>
+                  <pic:blipFill>
+                    <a:blip r:embed="rId104"/>
+                    <a:stretch>
+                      <a:fillRect/>
+                    </a:stretch>
+                  </pic:blipFill>
+                  <pic:spPr>
+                    <a:xfrm>
+                      <a:off x="0" y="0"/>
+                      <a:ext cx="5580000" cy="2901600"/>
+                    </a:xfrm>
+                    <a:prstGeom prst="rect">
+                      <a:avLst/>
+                    </a:prstGeom>
+                  </pic:spPr>
+                </pic:pic>
+              </a:graphicData>
+            </a:graphic>
+          </wp:inline>
+        </w:drawing>
+      </w:r>
+    </w:p>
+    <w:p>
+      <w:pPr>
+        <w:spacing w:after="160"/>
+        <w:jc w:val="center"/>
+      </w:pPr>
+      <w:r>
+        <w:rPr>
+          <w:rFonts w:ascii="Times New Roman" w:hAnsi="Times New Roman" w:cs="Times New Roman"/>
+          <w:i/>
+          <w:iCs/>
+          <w:color w:val="555555"/>
+          <w:sz w:val="22"/>
+          <w:szCs w:val="22"/>
+        </w:rPr>
+        <w:t xml:space="preserve">4-rasm. App Store ilovalari soni o'sishi</w:t>
+      </w:r>
+    </w:p>
+    <w:p>
+      <w:pPr>
+        <w:spacing w:after="120" w:line="360" w:lineRule="auto"/>
+        <w:jc w:val="both"/>
+        <w:ind w:firstLine="709"/>
+      </w:pPr>
+      <w:r>
+        <w:rPr>
+          <w:rFonts w:ascii="Times New Roman" w:hAnsi="Times New Roman" w:cs="Times New Roman"/>
+          <w:sz w:val="28"/>
+          <w:szCs w:val="28"/>
+        </w:rPr>
+        <w:t xml:space="preserve">Ilovani joylash bosqichlari: Dasturchi avval Apple Developer Program a'zoligini (yillik to'lov asosida) rasmiylashtiradi. So'ngra Xcode yordamida tayyorlangan ilova App Store Connect platformasiga yuklanadi va ko'rib chiqishga (review) yuboriladi.</w:t>
+      </w:r>
+    </w:p>
+    <w:p>
+      <w:pPr>
+        <w:spacing w:after="120" w:line="360" w:lineRule="auto"/>
+        <w:jc w:val="both"/>
+        <w:ind w:firstLine="709"/>
+      </w:pPr>
+      <w:r>
+        <w:rPr>
+          <w:rFonts w:ascii="Times New Roman" w:hAnsi="Times New Roman" w:cs="Times New Roman"/>
+          <w:sz w:val="28"/>
+          <w:szCs w:val="28"/>
+        </w:rPr>
+        <w:t xml:space="preserve">Tekshirish (App Review) jarayoni: Har bir ilova maxsus mutaxassislar jamoasi tomonidan App Store Review Guidelines hujjati asosida sinovdan o'tkaziladi. Tekshiruv ham avtomatlashtirilgan vositalar, ham inson nazorati orqali amalga oshiriladi. Asosiy mezonlar:</w:t>
+      </w:r>
+    </w:p>
+    <w:p>
+      <w:pPr>
+        <w:spacing w:after="60" w:line="360" w:lineRule="auto"/>
+        <w:ind w:left="709" w:hanging="284"/>
+        <w:jc w:val="both"/>
+      </w:pPr>
+      <w:r>
+        <w:rPr>
+          <w:rFonts w:ascii="Times New Roman" w:hAnsi="Times New Roman" w:cs="Times New Roman"/>
+          <w:sz w:val="28"/>
+          <w:szCs w:val="28"/>
+        </w:rPr>
+        <w:t xml:space="preserve">•  Xavfsizlik: ilovada zararli kod yoki ma'lumotlarni ruxsatsiz yig'ish bo'lmasligi;</w:t>
+      </w:r>
+    </w:p>
+    <w:p>
+      <w:pPr>
+        <w:spacing w:after="60" w:line="360" w:lineRule="auto"/>
+        <w:ind w:left="709" w:hanging="284"/>
+        <w:jc w:val="both"/>
+      </w:pPr>
+      <w:r>
+        <w:rPr>
+          <w:rFonts w:ascii="Times New Roman" w:hAnsi="Times New Roman" w:cs="Times New Roman"/>
+          <w:sz w:val="28"/>
+          <w:szCs w:val="28"/>
+        </w:rPr>
+        <w:t xml:space="preserve">•  Funksionallik: ilova ishdan chiqmasligi (crash) va e'lon qilingan vazifalarni bajarishi;</w:t>
+      </w:r>
+    </w:p>
+    <w:p>
+      <w:pPr>
+        <w:spacing w:after="60" w:line="360" w:lineRule="auto"/>
+        <w:ind w:left="709" w:hanging="284"/>
+        <w:jc w:val="both"/>
+      </w:pPr>
+      <w:r>
+        <w:rPr>
+          <w:rFonts w:ascii="Times New Roman" w:hAnsi="Times New Roman" w:cs="Times New Roman"/>
+          <w:sz w:val="28"/>
+          <w:szCs w:val="28"/>
+        </w:rPr>
+        <w:t xml:space="preserve">•  Maxfiylik: ma'lumotlardan foydalanish uchun ruxsat so'rash va maxfiylik siyosatining mavjudligi;</w:t>
+      </w:r>
+    </w:p>
+    <w:p>
+      <w:pPr>
+        <w:spacing w:after="60" w:line="360" w:lineRule="auto"/>
+        <w:ind w:left="709" w:hanging="284"/>
+        <w:jc w:val="both"/>
+      </w:pPr>
+      <w:r>
+        <w:rPr>
+          <w:rFonts w:ascii="Times New Roman" w:hAnsi="Times New Roman" w:cs="Times New Roman"/>
+          <w:sz w:val="28"/>
+          <w:szCs w:val="28"/>
+        </w:rPr>
+        <w:t xml:space="preserve">•  Mazmun: noqonuniy yoki mualliflik huquqini buzuvchi kontentning yo'qligi.</w:t>
+      </w:r>
+    </w:p>
+    <w:p>
+      <w:pPr>
+        <w:spacing w:after="120" w:line="360" w:lineRule="auto"/>
+        <w:jc w:val="both"/>
+        <w:ind w:firstLine="709"/>
+      </w:pPr>
+      <w:r>
+        <w:rPr>
+          <w:rFonts w:ascii="Times New Roman" w:hAnsi="Times New Roman" w:cs="Times New Roman"/>
+          <w:sz w:val="28"/>
+          <w:szCs w:val="28"/>
+        </w:rPr>
+        <w:t xml:space="preserve">Tasdiqdan o'tgan ilova App Store da e'lon qilinadi. Ilova ichidagi xaridlar (In-App Purchase) va obunalar Apple ning to'lov tizimi orqali amalga oshirilib, bundan odatda 15–30% komissiya ushlab qolinadi. Bu nazorat tizimi zararli ilovalar sonini keskin kamaytirsa-da, ko'pincha 'monopoliya' tanqidlariga sabab bo'ladi.</w:t>
+      </w:r>
+    </w:p>
+    <w:p>
+      <w:r>
+        <w:br w:type="page"/>
+      </w:r>
+    </w:p>
+    <w:p>
+      <w:pPr>
+        <w:pStyle w:val="2"/>
+        <w:spacing w:before="240" w:after="120"/>
+      </w:pPr>
+      <w:r>
+        <w:rPr>
+          <w:rFonts w:ascii="Times New Roman" w:hAnsi="Times New Roman" w:cs="Times New Roman"/>
+          <w:b/>
+          <w:bCs/>
+          <w:sz w:val="28"/>
+          <w:szCs w:val="28"/>
+        </w:rPr>
+        <w:t xml:space="preserve">4. iOS ning asosiy framework lari (UIKit, SwiftUI, Core Data, Core ML)</w:t>
+      </w:r>
+    </w:p>
+    <w:p>
+      <w:pPr>
+        <w:spacing w:after="120" w:line="360" w:lineRule="auto"/>
+        <w:jc w:val="both"/>
+        <w:ind w:firstLine="709"/>
+      </w:pPr>
+      <w:r>
+        <w:rPr>
+          <w:rFonts w:ascii="Times New Roman" w:hAnsi="Times New Roman" w:cs="Times New Roman"/>
+          <w:sz w:val="28"/>
+          <w:szCs w:val="28"/>
+        </w:rPr>
+        <w:t xml:space="preserve">Apple dasturchilarga ilova yaratishni osonlashtiruvchi tayyor kutubxonalar — freymvorklar to'plamini taqdim etadi. Ularning har biri muayyan vazifaga ixtisoslashgan. Quyida to'rtta asosiy freymvork ko'rib chiqiladi.</w:t>
+      </w:r>
+    </w:p>
+    <w:p>
+      <w:pPr>
+        <w:spacing w:after="120" w:line="360" w:lineRule="auto"/>
+        <w:jc w:val="both"/>
+        <w:ind w:firstLine="709"/>
+      </w:pPr>
+      <w:r>
+        <w:rPr>
+          <w:rFonts w:ascii="Times New Roman" w:hAnsi="Times New Roman" w:cs="Times New Roman"/>
+          <w:sz w:val="28"/>
+          <w:szCs w:val="28"/>
+        </w:rPr>
+        <w:t xml:space="preserve">UIKit: 2008-yildan beri qo'llanilib kelinayotgan, foydalanuvchi interfeysini (tugma, ro'yxat, oyna, animatsiya) yaratish uchun mo'ljallangan asosiy va eng yetuk freymvork. U imperativ yondashuvga asoslangan bo'lib, interfeys elementlarini qadamma-qadam boshqarishni talab qiladi.</w:t>
+      </w:r>
+    </w:p>
+    <w:p>
+      <w:pPr>
+        <w:spacing w:after="120" w:line="360" w:lineRule="auto"/>
+        <w:jc w:val="both"/>
+        <w:ind w:firstLine="709"/>
+      </w:pPr>
+      <w:r>
+        <w:rPr>
+          <w:rFonts w:ascii="Times New Roman" w:hAnsi="Times New Roman" w:cs="Times New Roman"/>
+          <w:sz w:val="28"/>
+          <w:szCs w:val="28"/>
+        </w:rPr>
+        <w:t xml:space="preserve">SwiftUI: 2019-yilda taqdim etilgan zamonaviy, deklarativ freymvork. Bunda dasturchi interfeysning qanday ko'rinishi kerakligini tavsiflaydi, tizim esa uni avtomatik chizadi va ma'lumot o'zgarganda yangilaydi. SwiftUI bitta kod bazasidan iPhone, iPad, Mac, Apple Watch va Apple TV uchun interfeys yaratish imkonini beradi.</w:t>
+      </w:r>
+    </w:p>
+    <w:p>
+      <w:pPr>
+        <w:spacing w:after="120" w:line="360" w:lineRule="auto"/>
+        <w:jc w:val="both"/>
+        <w:ind w:firstLine="709"/>
+      </w:pPr>
+      <w:r>
+        <w:rPr>
+          <w:rFonts w:ascii="Times New Roman" w:hAnsi="Times New Roman" w:cs="Times New Roman"/>
+          <w:sz w:val="28"/>
+          <w:szCs w:val="28"/>
+        </w:rPr>
+        <w:t xml:space="preserve">Core Data: ilova ma'lumotlarini qurilma ichida saqlash va boshqarish uchun ishlatiladigan ramka (persistence framework). U ma'lumotlar bazasi (odatda SQLite) ustida obyektga yo'naltirilgan qatlam vazifasini bajarib, dasturchini past darajadagi SQL so'rovlaridan ozod qiladi.</w:t>
+      </w:r>
+    </w:p>
+    <w:p>
+      <w:pPr>
+        <w:spacing w:after="120" w:line="360" w:lineRule="auto"/>
+        <w:jc w:val="both"/>
+        <w:ind w:firstLine="709"/>
+      </w:pPr>
+      <w:r>
+        <w:rPr>
+          <w:rFonts w:ascii="Times New Roman" w:hAnsi="Times New Roman" w:cs="Times New Roman"/>
+          <w:sz w:val="28"/>
+          <w:szCs w:val="28"/>
+        </w:rPr>
+        <w:t xml:space="preserve">Core ML: 2017-yilda joriy etilgan, sun'iy intellekt va mashinaviy o'qitish modellarini qurilma ichida ishlatish uchun mo'ljallangan freymvork. Hisob-kitoblar bevosita qurilmada (on-device) amalga oshirilgani uchun ma'lumotlar tashqi serverga yuborilmaydi — bu maxfiylikni ta'minlaydi va internetsiz ham tez ishlashga imkon beradi.</w:t>
+      </w:r>
+    </w:p>
+    <w:tbl>
+      <w:tblPr>
+        <w:tblStyle w:val="a3"/>
+        <w:tblW w:w="0" w:type="auto"/>
+        <w:jc w:val="center"/>
+        <w:tblBorders>
+          <w:top w:val="single" w:sz="6" w:space="0" w:color="808080"/>
+          <w:left w:val="single" w:sz="6" w:space="0" w:color="808080"/>
+          <w:bottom w:val="single" w:sz="6" w:space="0" w:color="808080"/>
+          <w:right w:val="single" w:sz="6" w:space="0" w:color="808080"/>
+          <w:insideH w:val="single" w:sz="6" w:space="0" w:color="808080"/>
+          <w:insideV w:val="single" w:sz="6" w:space="0" w:color="808080"/>
+        </w:tblBorders>
+        <w:tblLook w:val="04A0" w:firstRow="1" w:lastRow="0" w:firstColumn="1" w:lastColumn="0" w:noHBand="0" w:noVBand="1"/>
+      </w:tblPr>
+      <w:tblGrid>
+        <w:gridCol w:w="2200"/>
+        <w:gridCol w:w="2600"/>
+        <w:gridCol w:w="4200"/>
+      </w:tblGrid>
+      <w:tr>
+        <w:tc>
+          <w:tcPr>
+            <w:tcW w:w="2200" w:type="dxa"/>
+            <w:shd w:val="clear" w:color="auto" w:fill="007AFF"/>
+            <w:vAlign w:val="center"/>
+          </w:tcPr>
+          <w:p>
+            <w:pPr>
+              <w:spacing w:after="0" w:line="264" w:lineRule="auto"/>
+              <w:jc w:val="center"/>
+            </w:pPr>
+            <w:r>
+              <w:rPr>
+                <w:rFonts w:ascii="Times New Roman" w:hAnsi="Times New Roman" w:cs="Times New Roman"/>
+                <w:b/>
+                <w:bCs/>
+                <w:color w:val="FFFFFF"/>
+                <w:sz w:val="24"/>
+                <w:szCs w:val="24"/>
+              </w:rPr>
+              <w:t xml:space="preserve">Freymvork</w:t>
+            </w:r>
+          </w:p>
+        </w:tc>
+        <w:tc>
+          <w:tcPr>
+            <w:tcW w:w="2600" w:type="dxa"/>
+            <w:shd w:val="clear" w:color="auto" w:fill="007AFF"/>
+            <w:vAlign w:val="center"/>
+          </w:tcPr>
+          <w:p>
+            <w:pPr>
+              <w:spacing w:after="0" w:line="264" w:lineRule="auto"/>
+              <w:jc w:val="center"/>
+            </w:pPr>
+            <w:r>
+              <w:rPr>
+                <w:rFonts w:ascii="Times New Roman" w:hAnsi="Times New Roman" w:cs="Times New Roman"/>
+                <w:b/>
+                <w:bCs/>
+                <w:color w:val="FFFFFF"/>
+                <w:sz w:val="24"/>
+                <w:szCs w:val="24"/>
+              </w:rPr>
+              <w:t xml:space="preserve">Joriy etilgan</w:t>
+            </w:r>
+          </w:p>
+        </w:tc>
+        <w:tc>
+          <w:tcPr>
+            <w:tcW w:w="4200" w:type="dxa"/>
+            <w:shd w:val="clear" w:color="auto" w:fill="007AFF"/>
+            <w:vAlign w:val="center"/>
+          </w:tcPr>
+          <w:p>
+            <w:pPr>
+              <w:spacing w:after="0" w:line="264" w:lineRule="auto"/>
+              <w:jc w:val="center"/>
+            </w:pPr>
+            <w:r>
+              <w:rPr>
+                <w:rFonts w:ascii="Times New Roman" w:hAnsi="Times New Roman" w:cs="Times New Roman"/>
+                <w:b/>
+                <w:bCs/>
+                <w:color w:val="FFFFFF"/>
+                <w:sz w:val="24"/>
+                <w:szCs w:val="24"/>
+              </w:rPr>
+              <w:t xml:space="preserve">Asosiy vazifasi</w:t>
+            </w:r>
+          </w:p>
+        </w:tc>
+      </w:tr>
+      <w:tr>
+        <w:tc>
+          <w:tcPr>
+            <w:tcW w:w="2200" w:type="dxa"/>
+            <w:vAlign w:val="center"/>
+          </w:tcPr>
+          <w:p>
+            <w:pPr>
+              <w:spacing w:after="0" w:line="264" w:lineRule="auto"/>
+              <w:jc w:val="center"/>
+            </w:pPr>
+            <w:r>
+              <w:rPr>
+                <w:rFonts w:ascii="Times New Roman" w:hAnsi="Times New Roman" w:cs="Times New Roman"/>
+                <w:sz w:val="24"/>
+                <w:szCs w:val="24"/>
+              </w:rPr>
+              <w:t xml:space="preserve">UIKit</w:t>
+            </w:r>
+          </w:p>
+        </w:tc>
+        <w:tc>
+          <w:tcPr>
+            <w:tcW w:w="2600" w:type="dxa"/>
+            <w:vAlign w:val="center"/>
+          </w:tcPr>
+          <w:p>
+            <w:pPr>
+              <w:spacing w:after="0" w:line="264" w:lineRule="auto"/>
+              <w:jc w:val="center"/>
+            </w:pPr>
+            <w:r>
+              <w:rPr>
+                <w:rFonts w:ascii="Times New Roman" w:hAnsi="Times New Roman" w:cs="Times New Roman"/>
+                <w:sz w:val="24"/>
+                <w:szCs w:val="24"/>
+              </w:rPr>
+              <w:t xml:space="preserve">2008</w:t>
+            </w:r>
+          </w:p>
+        </w:tc>
+        <w:tc>
+          <w:tcPr>
+            <w:tcW w:w="4200" w:type="dxa"/>
+            <w:vAlign w:val="center"/>
+          </w:tcPr>
+          <w:p>
+            <w:pPr>
+              <w:spacing w:after="0" w:line="264" w:lineRule="auto"/>
+              <w:jc w:val="both"/>
+            </w:pPr>
+            <w:r>
+              <w:rPr>
+                <w:rFonts w:ascii="Times New Roman" w:hAnsi="Times New Roman" w:cs="Times New Roman"/>
+                <w:sz w:val="24"/>
+                <w:szCs w:val="24"/>
+              </w:rPr>
+              <w:t xml:space="preserve">Imperativ usulda foydalanuvchi interfeysini yaratish</w:t>
+            </w:r>
+          </w:p>
+        </w:tc>
+      </w:tr>
+      <w:tr>
+        <w:tc>
+          <w:tcPr>
+            <w:tcW w:w="2200" w:type="dxa"/>
+            <w:vAlign w:val="center"/>
+          </w:tcPr>
+          <w:p>
+            <w:pPr>
+              <w:spacing w:after="0" w:line="264" w:lineRule="auto"/>
+              <w:jc w:val="center"/>
+            </w:pPr>
+            <w:r>
+              <w:rPr>
+                <w:rFonts w:ascii="Times New Roman" w:hAnsi="Times New Roman" w:cs="Times New Roman"/>
+                <w:sz w:val="24"/>
+                <w:szCs w:val="24"/>
+              </w:rPr>
+              <w:t xml:space="preserve">SwiftUI</w:t>
+            </w:r>
+          </w:p>
+        </w:tc>
+        <w:tc>
+          <w:tcPr>
+            <w:tcW w:w="2600" w:type="dxa"/>
+            <w:vAlign w:val="center"/>
+          </w:tcPr>
+          <w:p>
+            <w:pPr>
+              <w:spacing w:after="0" w:line="264" w:lineRule="auto"/>
+              <w:jc w:val="center"/>
+            </w:pPr>
+            <w:r>
+              <w:rPr>
+                <w:rFonts w:ascii="Times New Roman" w:hAnsi="Times New Roman" w:cs="Times New Roman"/>
+                <w:sz w:val="24"/>
+                <w:szCs w:val="24"/>
+              </w:rPr>
+              <w:t xml:space="preserve">2019</w:t>
+            </w:r>
+          </w:p>
+        </w:tc>
+        <w:tc>
+          <w:tcPr>
+            <w:tcW w:w="4200" w:type="dxa"/>
+            <w:vAlign w:val="center"/>
+          </w:tcPr>
+          <w:p>
+            <w:pPr>
+              <w:spacing w:after="0" w:line="264" w:lineRule="auto"/>
+              <w:jc w:val="both"/>
+            </w:pPr>
+            <w:r>
+              <w:rPr>
+                <w:rFonts w:ascii="Times New Roman" w:hAnsi="Times New Roman" w:cs="Times New Roman"/>
+                <w:sz w:val="24"/>
+                <w:szCs w:val="24"/>
+              </w:rPr>
+              <w:t xml:space="preserve">Deklarativ, ko'p platformali interfeys qurish</w:t>
+            </w:r>
+          </w:p>
+        </w:tc>
+      </w:tr>
+      <w:tr>
+        <w:tc>
+          <w:tcPr>
+            <w:tcW w:w="2200" w:type="dxa"/>
+            <w:vAlign w:val="center"/>
+          </w:tcPr>
+          <w:p>
+            <w:pPr>
+              <w:spacing w:after="0" w:line="264" w:lineRule="auto"/>
+              <w:jc w:val="center"/>
+            </w:pPr>
+            <w:r>
+              <w:rPr>
+                <w:rFonts w:ascii="Times New Roman" w:hAnsi="Times New Roman" w:cs="Times New Roman"/>
+                <w:sz w:val="24"/>
+                <w:szCs w:val="24"/>
+              </w:rPr>
+              <w:t xml:space="preserve">Core Data</w:t>
+            </w:r>
+          </w:p>
+        </w:tc>
+        <w:tc>
+          <w:tcPr>
+            <w:tcW w:w="2600" w:type="dxa"/>
+            <w:vAlign w:val="center"/>
+          </w:tcPr>
+          <w:p>
+            <w:pPr>
+              <w:spacing w:after="0" w:line="264" w:lineRule="auto"/>
+              <w:jc w:val="center"/>
+            </w:pPr>
+            <w:r>
+              <w:rPr>
+                <w:rFonts w:ascii="Times New Roman" w:hAnsi="Times New Roman" w:cs="Times New Roman"/>
+                <w:sz w:val="24"/>
+                <w:szCs w:val="24"/>
+              </w:rPr>
+              <w:t xml:space="preserve">2009</w:t>
+            </w:r>
+          </w:p>
+        </w:tc>
+        <w:tc>
+          <w:tcPr>
+            <w:tcW w:w="4200" w:type="dxa"/>
+            <w:vAlign w:val="center"/>
+          </w:tcPr>
+          <w:p>
+            <w:pPr>
+              <w:spacing w:after="0" w:line="264" w:lineRule="auto"/>
+              <w:jc w:val="both"/>
+            </w:pPr>
+            <w:r>
+              <w:rPr>
+                <w:rFonts w:ascii="Times New Roman" w:hAnsi="Times New Roman" w:cs="Times New Roman"/>
+                <w:sz w:val="24"/>
+                <w:szCs w:val="24"/>
+              </w:rPr>
+              <w:t xml:space="preserve">Ma'lumotlarni qurilma ichida saqlash va boshqarish</w:t>
+            </w:r>
+          </w:p>
+        </w:tc>
+      </w:tr>
+      <w:tr>
+        <w:tc>
+          <w:tcPr>
+            <w:tcW w:w="2200" w:type="dxa"/>
+            <w:vAlign w:val="center"/>
+          </w:tcPr>
+          <w:p>
+            <w:pPr>
+              <w:spacing w:after="0" w:line="264" w:lineRule="auto"/>
+              <w:jc w:val="center"/>
+            </w:pPr>
+            <w:r>
+              <w:rPr>
+                <w:rFonts w:ascii="Times New Roman" w:hAnsi="Times New Roman" w:cs="Times New Roman"/>
+                <w:sz w:val="24"/>
+                <w:szCs w:val="24"/>
+              </w:rPr>
+              <w:t xml:space="preserve">Core ML</w:t>
+            </w:r>
+          </w:p>
+        </w:tc>
+        <w:tc>
+          <w:tcPr>
+            <w:tcW w:w="2600" w:type="dxa"/>
+            <w:vAlign w:val="center"/>
+          </w:tcPr>
+          <w:p>
+            <w:pPr>
+              <w:spacing w:after="0" w:line="264" w:lineRule="auto"/>
+              <w:jc w:val="center"/>
+            </w:pPr>
+            <w:r>
+              <w:rPr>
+                <w:rFonts w:ascii="Times New Roman" w:hAnsi="Times New Roman" w:cs="Times New Roman"/>
+                <w:sz w:val="24"/>
+                <w:szCs w:val="24"/>
+              </w:rPr>
+              <w:t xml:space="preserve">2017</w:t>
+            </w:r>
+          </w:p>
+        </w:tc>
+        <w:tc>
+          <w:tcPr>
+            <w:tcW w:w="4200" w:type="dxa"/>
+            <w:vAlign w:val="center"/>
+          </w:tcPr>
+          <w:p>
+            <w:pPr>
+              <w:spacing w:after="0" w:line="264" w:lineRule="auto"/>
+              <w:jc w:val="both"/>
+            </w:pPr>
+            <w:r>
+              <w:rPr>
+                <w:rFonts w:ascii="Times New Roman" w:hAnsi="Times New Roman" w:cs="Times New Roman"/>
+                <w:sz w:val="24"/>
+                <w:szCs w:val="24"/>
+              </w:rPr>
+              <w:t xml:space="preserve">Sun'iy intellekt modellarini qurilmada ishlatish</w:t>
+            </w:r>
+          </w:p>
+        </w:tc>
+      </w:tr>
+      <w:p/>
+    </w:tbl>
+    <w:p>
+      <w:pPr>
+        <w:spacing w:before="60" w:after="200"/>
+        <w:jc w:val="center"/>
+      </w:pPr>
+      <w:r>
+        <w:rPr>
+          <w:rFonts w:ascii="Times New Roman" w:hAnsi="Times New Roman" w:cs="Times New Roman"/>
+          <w:i/>
+          <w:iCs/>
+          <w:color w:val="555555"/>
+          <w:sz w:val="22"/>
+          <w:szCs w:val="22"/>
+        </w:rPr>
+        <w:t xml:space="preserve">3-jadval. iOS ning asosiy dasturlash freymvorklari</w:t>
+      </w:r>
+    </w:p>
+    <w:p>
+      <w:r>
+        <w:br w:type="page"/>
+      </w:r>
+    </w:p>
+    <w:p>
+      <w:pPr>
+        <w:pStyle w:val="2"/>
+        <w:spacing w:before="240" w:after="120"/>
+      </w:pPr>
+      <w:r>
+        <w:rPr>
+          <w:rFonts w:ascii="Times New Roman" w:hAnsi="Times New Roman" w:cs="Times New Roman"/>
+          <w:b/>
+          <w:bCs/>
+          <w:sz w:val="28"/>
+          <w:szCs w:val="28"/>
+        </w:rPr>
+        <w:t xml:space="preserve">5. iPhone dan iPhone 15 gacha iOS evolyutsiyasining bosqichlari</w:t>
+      </w:r>
+    </w:p>
+    <w:p>
+      <w:pPr>
+        <w:spacing w:after="120" w:line="360" w:lineRule="auto"/>
+        <w:jc w:val="both"/>
+        <w:ind w:firstLine="709"/>
+      </w:pPr>
+      <w:r>
+        <w:rPr>
+          <w:rFonts w:ascii="Times New Roman" w:hAnsi="Times New Roman" w:cs="Times New Roman"/>
+          <w:sz w:val="28"/>
+          <w:szCs w:val="28"/>
+        </w:rPr>
+        <w:t xml:space="preserve">iOS ning rivojlanish tarixi 2007-yilda birinchi iPhone bilan boshlangan va shu vaqtdan beri har yili yangi versiya chiqarilib kelinmoqda. Quyida asosiy bosqichlar jadval ko'rinishida keltirilgan:</w:t>
+      </w:r>
+    </w:p>
+    <w:tbl>
+      <w:tblPr>
+        <w:tblStyle w:val="a3"/>
+        <w:tblW w:w="0" w:type="auto"/>
+        <w:jc w:val="center"/>
+        <w:tblBorders>
+          <w:top w:val="single" w:sz="6" w:space="0" w:color="808080"/>
+          <w:left w:val="single" w:sz="6" w:space="0" w:color="808080"/>
+          <w:bottom w:val="single" w:sz="6" w:space="0" w:color="808080"/>
+          <w:right w:val="single" w:sz="6" w:space="0" w:color="808080"/>
+          <w:insideH w:val="single" w:sz="6" w:space="0" w:color="808080"/>
+          <w:insideV w:val="single" w:sz="6" w:space="0" w:color="808080"/>
+        </w:tblBorders>
+        <w:tblLook w:val="04A0" w:firstRow="1" w:lastRow="0" w:firstColumn="1" w:lastColumn="0" w:noHBand="0" w:noVBand="1"/>
+      </w:tblPr>
+      <w:tblGrid>
+        <w:gridCol w:w="2200"/>
+        <w:gridCol w:w="1500"/>
+        <w:gridCol w:w="5300"/>
+      </w:tblGrid>
+      <w:tr>
+        <w:tc>
+          <w:tcPr>
+            <w:tcW w:w="2200" w:type="dxa"/>
+            <w:shd w:val="clear" w:color="auto" w:fill="007AFF"/>
+            <w:vAlign w:val="center"/>
+          </w:tcPr>
+          <w:p>
+            <w:pPr>
+              <w:spacing w:after="0" w:line="264" w:lineRule="auto"/>
+              <w:jc w:val="center"/>
+            </w:pPr>
+            <w:r>
+              <w:rPr>
+                <w:rFonts w:ascii="Times New Roman" w:hAnsi="Times New Roman" w:cs="Times New Roman"/>
+                <w:b/>
+                <w:bCs/>
+                <w:color w:val="FFFFFF"/>
+                <w:sz w:val="24"/>
+                <w:szCs w:val="24"/>
+              </w:rPr>
+              <w:t xml:space="preserve">Versiya</w:t>
+            </w:r>
+          </w:p>
+        </w:tc>
+        <w:tc>
+          <w:tcPr>
+            <w:tcW w:w="1500" w:type="dxa"/>
+            <w:shd w:val="clear" w:color="auto" w:fill="007AFF"/>
+            <w:vAlign w:val="center"/>
+          </w:tcPr>
+          <w:p>
+            <w:pPr>
+              <w:spacing w:after="0" w:line="264" w:lineRule="auto"/>
+              <w:jc w:val="center"/>
+            </w:pPr>
+            <w:r>
+              <w:rPr>
+                <w:rFonts w:ascii="Times New Roman" w:hAnsi="Times New Roman" w:cs="Times New Roman"/>
+                <w:b/>
+                <w:bCs/>
+                <w:color w:val="FFFFFF"/>
+                <w:sz w:val="24"/>
+                <w:szCs w:val="24"/>
+              </w:rPr>
+              <w:t xml:space="preserve">Yil</w:t>
+            </w:r>
+          </w:p>
+        </w:tc>
+        <w:tc>
+          <w:tcPr>
+            <w:tcW w:w="5300" w:type="dxa"/>
+            <w:shd w:val="clear" w:color="auto" w:fill="007AFF"/>
+            <w:vAlign w:val="center"/>
+          </w:tcPr>
+          <w:p>
+            <w:pPr>
+              <w:spacing w:after="0" w:line="264" w:lineRule="auto"/>
+              <w:jc w:val="center"/>
+            </w:pPr>
+            <w:r>
+              <w:rPr>
+                <w:rFonts w:ascii="Times New Roman" w:hAnsi="Times New Roman" w:cs="Times New Roman"/>
+                <w:b/>
+                <w:bCs/>
+                <w:color w:val="FFFFFF"/>
+                <w:sz w:val="24"/>
+                <w:szCs w:val="24"/>
+              </w:rPr>
+              <w:t xml:space="preserve">Asosiy yangilik</w:t>
+            </w:r>
+          </w:p>
+        </w:tc>
+      </w:tr>
+      <w:tr>
+        <w:tc>
+          <w:tcPr>
+            <w:tcW w:w="2200" w:type="dxa"/>
+            <w:vAlign w:val="center"/>
+          </w:tcPr>
+          <w:p>
+            <w:pPr>
+              <w:spacing w:after="0" w:line="264" w:lineRule="auto"/>
+              <w:jc w:val="center"/>
+            </w:pPr>
+            <w:r>
+              <w:rPr>
+                <w:rFonts w:ascii="Times New Roman" w:hAnsi="Times New Roman" w:cs="Times New Roman"/>
+                <w:sz w:val="24"/>
+                <w:szCs w:val="24"/>
+              </w:rPr>
+              <w:t xml:space="preserve">iPhone OS 1</w:t>
+            </w:r>
+          </w:p>
+        </w:tc>
+        <w:tc>
+          <w:tcPr>
+            <w:tcW w:w="1500" w:type="dxa"/>
+            <w:vAlign w:val="center"/>
+          </w:tcPr>
+          <w:p>
+            <w:pPr>
+              <w:spacing w:after="0" w:line="264" w:lineRule="auto"/>
+              <w:jc w:val="center"/>
+            </w:pPr>
+            <w:r>
+              <w:rPr>
+                <w:rFonts w:ascii="Times New Roman" w:hAnsi="Times New Roman" w:cs="Times New Roman"/>
+                <w:sz w:val="24"/>
+                <w:szCs w:val="24"/>
+              </w:rPr>
+              <w:t xml:space="preserve">2007</w:t>
+            </w:r>
+          </w:p>
+        </w:tc>
+        <w:tc>
+          <w:tcPr>
+            <w:tcW w:w="5300" w:type="dxa"/>
+            <w:vAlign w:val="center"/>
+          </w:tcPr>
+          <w:p>
+            <w:pPr>
+              <w:spacing w:after="0" w:line="264" w:lineRule="auto"/>
+              <w:jc w:val="both"/>
+            </w:pPr>
+            <w:r>
+              <w:rPr>
+                <w:rFonts w:ascii="Times New Roman" w:hAnsi="Times New Roman" w:cs="Times New Roman"/>
+                <w:sz w:val="24"/>
+                <w:szCs w:val="24"/>
+              </w:rPr>
+              <w:t xml:space="preserve">Multitouch sensorli interfeys (App Store hali yo'q)</w:t>
+            </w:r>
+          </w:p>
+        </w:tc>
+      </w:tr>
+      <w:tr>
+        <w:tc>
+          <w:tcPr>
+            <w:tcW w:w="2200" w:type="dxa"/>
+            <w:vAlign w:val="center"/>
+          </w:tcPr>
+          <w:p>
+            <w:pPr>
+              <w:spacing w:after="0" w:line="264" w:lineRule="auto"/>
+              <w:jc w:val="center"/>
+            </w:pPr>
+            <w:r>
+              <w:rPr>
+                <w:rFonts w:ascii="Times New Roman" w:hAnsi="Times New Roman" w:cs="Times New Roman"/>
+                <w:sz w:val="24"/>
+                <w:szCs w:val="24"/>
+              </w:rPr>
+              <w:t xml:space="preserve">iPhone OS 2</w:t>
+            </w:r>
+          </w:p>
+        </w:tc>
+        <w:tc>
+          <w:tcPr>
+            <w:tcW w:w="1500" w:type="dxa"/>
+            <w:vAlign w:val="center"/>
+          </w:tcPr>
+          <w:p>
+            <w:pPr>
+              <w:spacing w:after="0" w:line="264" w:lineRule="auto"/>
+              <w:jc w:val="center"/>
+            </w:pPr>
+            <w:r>
+              <w:rPr>
+                <w:rFonts w:ascii="Times New Roman" w:hAnsi="Times New Roman" w:cs="Times New Roman"/>
+                <w:sz w:val="24"/>
+                <w:szCs w:val="24"/>
+              </w:rPr>
+              <w:t xml:space="preserve">2008</w:t>
+            </w:r>
+          </w:p>
+        </w:tc>
+        <w:tc>
+          <w:tcPr>
+            <w:tcW w:w="5300" w:type="dxa"/>
+            <w:vAlign w:val="center"/>
+          </w:tcPr>
+          <w:p>
+            <w:pPr>
+              <w:spacing w:after="0" w:line="264" w:lineRule="auto"/>
+              <w:jc w:val="both"/>
+            </w:pPr>
+            <w:r>
+              <w:rPr>
+                <w:rFonts w:ascii="Times New Roman" w:hAnsi="Times New Roman" w:cs="Times New Roman"/>
+                <w:sz w:val="24"/>
+                <w:szCs w:val="24"/>
+              </w:rPr>
+              <w:t xml:space="preserve">App Store ishga tushirildi, dasturchilar ekotizimi</w:t>
+            </w:r>
+          </w:p>
+        </w:tc>
+      </w:tr>
+      <w:tr>
+        <w:tc>
+          <w:tcPr>
+            <w:tcW w:w="2200" w:type="dxa"/>
+            <w:vAlign w:val="center"/>
+          </w:tcPr>
+          <w:p>
+            <w:pPr>
+              <w:spacing w:after="0" w:line="264" w:lineRule="auto"/>
+              <w:jc w:val="center"/>
+            </w:pPr>
+            <w:r>
+              <w:rPr>
+                <w:rFonts w:ascii="Times New Roman" w:hAnsi="Times New Roman" w:cs="Times New Roman"/>
+                <w:sz w:val="24"/>
+                <w:szCs w:val="24"/>
+              </w:rPr>
+              <w:t xml:space="preserve">iOS 5</w:t>
+            </w:r>
+          </w:p>
+        </w:tc>
+        <w:tc>
+          <w:tcPr>
+            <w:tcW w:w="1500" w:type="dxa"/>
+            <w:vAlign w:val="center"/>
+          </w:tcPr>
+          <w:p>
+            <w:pPr>
+              <w:spacing w:after="0" w:line="264" w:lineRule="auto"/>
+              <w:jc w:val="center"/>
+            </w:pPr>
+            <w:r>
+              <w:rPr>
+                <w:rFonts w:ascii="Times New Roman" w:hAnsi="Times New Roman" w:cs="Times New Roman"/>
+                <w:sz w:val="24"/>
+                <w:szCs w:val="24"/>
+              </w:rPr>
+              <w:t xml:space="preserve">2011</w:t>
+            </w:r>
+          </w:p>
+        </w:tc>
+        <w:tc>
+          <w:tcPr>
+            <w:tcW w:w="5300" w:type="dxa"/>
+            <w:vAlign w:val="center"/>
+          </w:tcPr>
+          <w:p>
+            <w:pPr>
+              <w:spacing w:after="0" w:line="264" w:lineRule="auto"/>
+              <w:jc w:val="both"/>
+            </w:pPr>
+            <w:r>
+              <w:rPr>
+                <w:rFonts w:ascii="Times New Roman" w:hAnsi="Times New Roman" w:cs="Times New Roman"/>
+                <w:sz w:val="24"/>
+                <w:szCs w:val="24"/>
+              </w:rPr>
+              <w:t xml:space="preserve">Siri ovozli yordamchisi, iCloud, bildirishnomalar markazi</w:t>
+            </w:r>
+          </w:p>
+        </w:tc>
+      </w:tr>
+      <w:tr>
+        <w:tc>
+          <w:tcPr>
+            <w:tcW w:w="2200" w:type="dxa"/>
+            <w:vAlign w:val="center"/>
+          </w:tcPr>
+          <w:p>
+            <w:pPr>
+              <w:spacing w:after="0" w:line="264" w:lineRule="auto"/>
+              <w:jc w:val="center"/>
+            </w:pPr>
+            <w:r>
+              <w:rPr>
+                <w:rFonts w:ascii="Times New Roman" w:hAnsi="Times New Roman" w:cs="Times New Roman"/>
+                <w:sz w:val="24"/>
+                <w:szCs w:val="24"/>
+              </w:rPr>
+              <w:t xml:space="preserve">iOS 7</w:t>
+            </w:r>
+          </w:p>
+        </w:tc>
+        <w:tc>
+          <w:tcPr>
+            <w:tcW w:w="1500" w:type="dxa"/>
+            <w:vAlign w:val="center"/>
+          </w:tcPr>
+          <w:p>
+            <w:pPr>
+              <w:spacing w:after="0" w:line="264" w:lineRule="auto"/>
+              <w:jc w:val="center"/>
+            </w:pPr>
+            <w:r>
+              <w:rPr>
+                <w:rFonts w:ascii="Times New Roman" w:hAnsi="Times New Roman" w:cs="Times New Roman"/>
+                <w:sz w:val="24"/>
+                <w:szCs w:val="24"/>
+              </w:rPr>
+              <w:t xml:space="preserve">2013</w:t>
+            </w:r>
+          </w:p>
+        </w:tc>
+        <w:tc>
+          <w:tcPr>
+            <w:tcW w:w="5300" w:type="dxa"/>
+            <w:vAlign w:val="center"/>
+          </w:tcPr>
+          <w:p>
+            <w:pPr>
+              <w:spacing w:after="0" w:line="264" w:lineRule="auto"/>
+              <w:jc w:val="both"/>
+            </w:pPr>
+            <w:r>
+              <w:rPr>
+                <w:rFonts w:ascii="Times New Roman" w:hAnsi="Times New Roman" w:cs="Times New Roman"/>
+                <w:sz w:val="24"/>
+                <w:szCs w:val="24"/>
+              </w:rPr>
+              <w:t xml:space="preserve">Tekis (flat) dizaynga tub o'tish</w:t>
+            </w:r>
+          </w:p>
+        </w:tc>
+      </w:tr>
+      <w:tr>
+        <w:tc>
+          <w:tcPr>
+            <w:tcW w:w="2200" w:type="dxa"/>
+            <w:vAlign w:val="center"/>
+          </w:tcPr>
+          <w:p>
+            <w:pPr>
+              <w:spacing w:after="0" w:line="264" w:lineRule="auto"/>
+              <w:jc w:val="center"/>
+            </w:pPr>
+            <w:r>
+              <w:rPr>
+                <w:rFonts w:ascii="Times New Roman" w:hAnsi="Times New Roman" w:cs="Times New Roman"/>
+                <w:sz w:val="24"/>
+                <w:szCs w:val="24"/>
+              </w:rPr>
+              <w:t xml:space="preserve">iOS 11</w:t>
+            </w:r>
+          </w:p>
+        </w:tc>
+        <w:tc>
+          <w:tcPr>
+            <w:tcW w:w="1500" w:type="dxa"/>
+            <w:vAlign w:val="center"/>
+          </w:tcPr>
+          <w:p>
+            <w:pPr>
+              <w:spacing w:after="0" w:line="264" w:lineRule="auto"/>
+              <w:jc w:val="center"/>
+            </w:pPr>
+            <w:r>
+              <w:rPr>
+                <w:rFonts w:ascii="Times New Roman" w:hAnsi="Times New Roman" w:cs="Times New Roman"/>
+                <w:sz w:val="24"/>
+                <w:szCs w:val="24"/>
+              </w:rPr>
+              <w:t xml:space="preserve">2017</w:t>
+            </w:r>
+          </w:p>
+        </w:tc>
+        <w:tc>
+          <w:tcPr>
+            <w:tcW w:w="5300" w:type="dxa"/>
+            <w:vAlign w:val="center"/>
+          </w:tcPr>
+          <w:p>
+            <w:pPr>
+              <w:spacing w:after="0" w:line="264" w:lineRule="auto"/>
+              <w:jc w:val="both"/>
+            </w:pPr>
+            <w:r>
+              <w:rPr>
+                <w:rFonts w:ascii="Times New Roman" w:hAnsi="Times New Roman" w:cs="Times New Roman"/>
+                <w:sz w:val="24"/>
+                <w:szCs w:val="24"/>
+              </w:rPr>
+              <w:t xml:space="preserve">Face ID (iPhone X), ARKit, qayta ishlangan UI</w:t>
+            </w:r>
+          </w:p>
+        </w:tc>
+      </w:tr>
+      <w:tr>
+        <w:tc>
+          <w:tcPr>
+            <w:tcW w:w="2200" w:type="dxa"/>
+            <w:vAlign w:val="center"/>
+          </w:tcPr>
+          <w:p>
+            <w:pPr>
+              <w:spacing w:after="0" w:line="264" w:lineRule="auto"/>
+              <w:jc w:val="center"/>
+            </w:pPr>
+            <w:r>
+              <w:rPr>
+                <w:rFonts w:ascii="Times New Roman" w:hAnsi="Times New Roman" w:cs="Times New Roman"/>
+                <w:sz w:val="24"/>
+                <w:szCs w:val="24"/>
+              </w:rPr>
+              <w:t xml:space="preserve">iOS 13</w:t>
+            </w:r>
+          </w:p>
+        </w:tc>
+        <w:tc>
+          <w:tcPr>
+            <w:tcW w:w="1500" w:type="dxa"/>
+            <w:vAlign w:val="center"/>
+          </w:tcPr>
+          <w:p>
+            <w:pPr>
+              <w:spacing w:after="0" w:line="264" w:lineRule="auto"/>
+              <w:jc w:val="center"/>
+            </w:pPr>
+            <w:r>
+              <w:rPr>
+                <w:rFonts w:ascii="Times New Roman" w:hAnsi="Times New Roman" w:cs="Times New Roman"/>
+                <w:sz w:val="24"/>
+                <w:szCs w:val="24"/>
+              </w:rPr>
+              <w:t xml:space="preserve">2019</w:t>
+            </w:r>
+          </w:p>
+        </w:tc>
+        <w:tc>
+          <w:tcPr>
+            <w:tcW w:w="5300" w:type="dxa"/>
+            <w:vAlign w:val="center"/>
+          </w:tcPr>
+          <w:p>
+            <w:pPr>
+              <w:spacing w:after="0" w:line="264" w:lineRule="auto"/>
+              <w:jc w:val="both"/>
+            </w:pPr>
+            <w:r>
+              <w:rPr>
+                <w:rFonts w:ascii="Times New Roman" w:hAnsi="Times New Roman" w:cs="Times New Roman"/>
+                <w:sz w:val="24"/>
+                <w:szCs w:val="24"/>
+              </w:rPr>
+              <w:t xml:space="preserve">Dark Mode, SwiftUI, maxfiylik kuchaytirildi</w:t>
+            </w:r>
+          </w:p>
+        </w:tc>
+      </w:tr>
+      <w:tr>
+        <w:tc>
+          <w:tcPr>
+            <w:tcW w:w="2200" w:type="dxa"/>
+            <w:vAlign w:val="center"/>
+          </w:tcPr>
+          <w:p>
+            <w:pPr>
+              <w:spacing w:after="0" w:line="264" w:lineRule="auto"/>
+              <w:jc w:val="center"/>
+            </w:pPr>
+            <w:r>
+              <w:rPr>
+                <w:rFonts w:ascii="Times New Roman" w:hAnsi="Times New Roman" w:cs="Times New Roman"/>
+                <w:sz w:val="24"/>
+                <w:szCs w:val="24"/>
+              </w:rPr>
+              <w:t xml:space="preserve">iOS 14</w:t>
+            </w:r>
+          </w:p>
+        </w:tc>
+        <w:tc>
+          <w:tcPr>
+            <w:tcW w:w="1500" w:type="dxa"/>
+            <w:vAlign w:val="center"/>
+          </w:tcPr>
+          <w:p>
+            <w:pPr>
+              <w:spacing w:after="0" w:line="264" w:lineRule="auto"/>
+              <w:jc w:val="center"/>
+            </w:pPr>
+            <w:r>
+              <w:rPr>
+                <w:rFonts w:ascii="Times New Roman" w:hAnsi="Times New Roman" w:cs="Times New Roman"/>
+                <w:sz w:val="24"/>
+                <w:szCs w:val="24"/>
+              </w:rPr>
+              <w:t xml:space="preserve">2020</w:t>
+            </w:r>
+          </w:p>
+        </w:tc>
+        <w:tc>
+          <w:tcPr>
+            <w:tcW w:w="5300" w:type="dxa"/>
+            <w:vAlign w:val="center"/>
+          </w:tcPr>
+          <w:p>
+            <w:pPr>
+              <w:spacing w:after="0" w:line="264" w:lineRule="auto"/>
+              <w:jc w:val="both"/>
+            </w:pPr>
+            <w:r>
+              <w:rPr>
+                <w:rFonts w:ascii="Times New Roman" w:hAnsi="Times New Roman" w:cs="Times New Roman"/>
+                <w:sz w:val="24"/>
+                <w:szCs w:val="24"/>
+              </w:rPr>
+              <w:t xml:space="preserve">Bosh ekran vidjetlari, App Library</w:t>
+            </w:r>
+          </w:p>
+        </w:tc>
+      </w:tr>
+      <w:tr>
+        <w:tc>
+          <w:tcPr>
+            <w:tcW w:w="2200" w:type="dxa"/>
+            <w:vAlign w:val="center"/>
+          </w:tcPr>
+          <w:p>
+            <w:pPr>
+              <w:spacing w:after="0" w:line="264" w:lineRule="auto"/>
+              <w:jc w:val="center"/>
+            </w:pPr>
+            <w:r>
+              <w:rPr>
+                <w:rFonts w:ascii="Times New Roman" w:hAnsi="Times New Roman" w:cs="Times New Roman"/>
+                <w:sz w:val="24"/>
+                <w:szCs w:val="24"/>
+              </w:rPr>
+              <w:t xml:space="preserve">iOS 17</w:t>
+            </w:r>
+          </w:p>
+        </w:tc>
+        <w:tc>
+          <w:tcPr>
+            <w:tcW w:w="1500" w:type="dxa"/>
+            <w:vAlign w:val="center"/>
+          </w:tcPr>
+          <w:p>
+            <w:pPr>
+              <w:spacing w:after="0" w:line="264" w:lineRule="auto"/>
+              <w:jc w:val="center"/>
+            </w:pPr>
+            <w:r>
+              <w:rPr>
+                <w:rFonts w:ascii="Times New Roman" w:hAnsi="Times New Roman" w:cs="Times New Roman"/>
+                <w:sz w:val="24"/>
+                <w:szCs w:val="24"/>
+              </w:rPr>
+              <w:t xml:space="preserve">2023</w:t>
+            </w:r>
+          </w:p>
+        </w:tc>
+        <w:tc>
+          <w:tcPr>
+            <w:tcW w:w="5300" w:type="dxa"/>
+            <w:vAlign w:val="center"/>
+          </w:tcPr>
+          <w:p>
+            <w:pPr>
+              <w:spacing w:after="0" w:line="264" w:lineRule="auto"/>
+              <w:jc w:val="both"/>
+            </w:pPr>
+            <w:r>
+              <w:rPr>
+                <w:rFonts w:ascii="Times New Roman" w:hAnsi="Times New Roman" w:cs="Times New Roman"/>
+                <w:sz w:val="24"/>
+                <w:szCs w:val="24"/>
+              </w:rPr>
+              <w:t xml:space="preserve">iPhone 15 + USB-C, A17 Pro, StandBy rejimi</w:t>
+            </w:r>
+          </w:p>
+        </w:tc>
+      </w:tr>
+      <w:p/>
+    </w:tbl>
+    <w:p>
+      <w:pPr>
+        <w:spacing w:before="60" w:after="200"/>
+        <w:jc w:val="center"/>
+      </w:pPr>
+      <w:r>
+        <w:rPr>
+          <w:rFonts w:ascii="Times New Roman" w:hAnsi="Times New Roman" w:cs="Times New Roman"/>
+          <w:i/>
+          <w:iCs/>
+          <w:color w:val="555555"/>
+          <w:sz w:val="22"/>
+          <w:szCs w:val="22"/>
+        </w:rPr>
+        <w:t xml:space="preserve">4-jadval. iOS versiyalarining asosiy bosqichlari</w:t>
+      </w:r>
+    </w:p>
+    <w:p>
+      <w:pPr>
+        <w:spacing w:after="120" w:line="360" w:lineRule="auto"/>
+        <w:jc w:val="both"/>
+        <w:ind w:firstLine="709"/>
+      </w:pPr>
+      <w:r>
+        <w:rPr>
+          <w:rFonts w:ascii="Times New Roman" w:hAnsi="Times New Roman" w:cs="Times New Roman"/>
+          <w:sz w:val="28"/>
+          <w:szCs w:val="28"/>
+        </w:rPr>
+        <w:t xml:space="preserve">2023-yilda iPhone 15 modeli bilan Apple birinchi marta o'zining Lightning ulagichidan voz kechib, universal USB-C standartiga o'tdi. Bundan tashqari Pro modellarida titan korpus va kuchli A17 Pro chipi taqdim etildi. Quyidagi diagramma hozirgi kunda faol qurilmalarda qaysi iOS versiyalari ishlayotganini ko'rsatadi:</w:t>
+      </w:r>
+    </w:p>
+    <w:p>
+      <w:pPr>
+        <w:spacing w:before="120" w:after="40"/>
+        <w:jc w:val="center"/>
+      </w:pPr>
+      <w:r>
+        <w:drawing>
+          <wp:inline distT="0" distB="0" distL="0" distR="0">
+            <wp:extent cx="5580000" cy="3100000"/>
+            <wp:effectExtent l="0" t="0" r="0" b="0"/>
+            <wp:docPr id="105" name="ios_pie"/>
+            <wp:cNvGraphicFramePr>
+              <a:graphicFrameLocks xmlns:a="http://schemas.openxmlformats.org/drawingml/2006/main" noChangeAspect="1"/>
+            </wp:cNvGraphicFramePr>
+            <a:graphic xmlns:a="http://schemas.openxmlformats.org/drawingml/2006/main">
+              <a:graphicData uri="http://schemas.openxmlformats.org/drawingml/2006/picture">
+                <pic:pic xmlns:pic="http://schemas.openxmlformats.org/drawingml/2006/picture">
+                  <pic:nvPicPr>
+                    <pic:cNvPr id="105" name="ios_pie"/>
+                    <pic:cNvPicPr/>
+                  </pic:nvPicPr>
+                  <pic:blipFill>
+                    <a:blip r:embed="rId105"/>
+                    <a:stretch>
+                      <a:fillRect/>
+                    </a:stretch>
+                  </pic:blipFill>
+                  <pic:spPr>
+                    <a:xfrm>
+                      <a:off x="0" y="0"/>
+                      <a:ext cx="5580000" cy="3100000"/>
+                    </a:xfrm>
+                    <a:prstGeom prst="rect">
+                      <a:avLst/>
+                    </a:prstGeom>
+                  </pic:spPr>
+                </pic:pic>
+              </a:graphicData>
+            </a:graphic>
+          </wp:inline>
+        </w:drawing>
+      </w:r>
+    </w:p>
+    <w:p>
+      <w:pPr>
+        <w:spacing w:after="160"/>
+        <w:jc w:val="center"/>
+      </w:pPr>
+      <w:r>
+        <w:rPr>
+          <w:rFonts w:ascii="Times New Roman" w:hAnsi="Times New Roman" w:cs="Times New Roman"/>
+          <w:i/>
+          <w:iCs/>
+          <w:color w:val="555555"/>
+          <w:sz w:val="22"/>
+          <w:szCs w:val="22"/>
+        </w:rPr>
+        <w:t xml:space="preserve">5-rasm. Faol iOS versiyalari taqsimoti</w:t>
+      </w:r>
+    </w:p>
+    <w:p>
+      <w:pPr>
+        <w:spacing w:after="120" w:line="360" w:lineRule="auto"/>
+        <w:jc w:val="both"/>
+        <w:ind w:firstLine="709"/>
+      </w:pPr>
+      <w:r>
+        <w:rPr>
+          <w:rFonts w:ascii="Times New Roman" w:hAnsi="Times New Roman" w:cs="Times New Roman"/>
+          <w:sz w:val="28"/>
+          <w:szCs w:val="28"/>
+        </w:rPr>
+        <w:t xml:space="preserve">Diagrammadan ko'rinadiki, Apple foydalanuvchilarining katta qismi eng so'nggi versiyaga tezda o'tadi. Bu — Android dagi fragmentatsiyadan farqli ravishda iOS ning muhim afzalligi bo'lib, dasturchilarga eski versiyalarni qo'llab-quvvatlash yukini kamaytiradi.</w:t>
+      </w:r>
+    </w:p>
+    <w:p>
+      <w:r>
+        <w:br w:type="page"/>
+      </w:r>
+    </w:p>
     <w:p>
       <w:pPr>
         <w:pStyle w:val="1"/>
@@ -1692,7 +3202,7 @@
           <w:sz w:val="30"/>
           <w:szCs w:val="30"/>
         </w:rPr>
-        <w:t xml:space="preserve">XULOSA</w:t>
+        <w:t xml:space="preserve">AMALIY QISM</w:t>
       </w:r>
     </w:p>
     <w:p>
@@ -1707,7 +3217,7 @@
           <w:sz w:val="28"/>
           <w:szCs w:val="28"/>
         </w:rPr>
-        <w:t xml:space="preserve">Ushbu mustaqil ish doirasida Apple kompaniyasining iOS mobil operatsion tizimi — uning xavfsizlik arxitekturasi, dasturlash freymvorklari, App Store ekotizimi va rivojlanish evolyutsiyasi har tomonlama tahlil qilindi.</w:t>
+        <w:t xml:space="preserve">Amaliy qism doirasida iOS da ilova ishga tushganda himoya mexanizmlari qanday ketma-ketlikda ishlashini ko'rib chiqamiz (yuqorida 3-rasmda keltirilgan yuklash zanjiri davomi). Foydalanuvchi ilovani ochganda, qurilma avval kod imzosini tekshiradi, so'ngra ilova Sandbox ichida ishga tushadi va maxfiy resurslar uchun ruxsat so'raladi.</w:t>
       </w:r>
     </w:p>
     <w:p>
@@ -1722,8 +3232,178 @@
           <w:sz w:val="28"/>
           <w:szCs w:val="28"/>
         </w:rPr>
-        <w:t xml:space="preserve">Olib borilgan tahlil natijasida quyidagi xulosalarni shakllantirish mumkin. Birinchidan, iOS ning asosiy kuchi uning apparat va dasturiy ta'minotni yagona kompaniya nazorat qiladigan yopiq, lekin yaxlit ekotizimida namoyon bo'ladi. Boot ROM dan tortib Secure Enclave va Sandboxing gacha bo'lgan ko'p qatlamli himoya iOS ni bozordagi eng xavfsiz mobil platformalardan biriga aylantiradi.</w:t>
-      </w:r>
+        <w:t xml:space="preserve">Quyida SwiftUI yordamida yaratilgan oddiy interfeys misoli keltirilgan. Ushbu kod ekranda matn va tugma ko'rsatadi (deklarativ yondashuv namunasi):</w:t>
+      </w:r>
+    </w:p>
+    <w:p>
+      <w:pPr>
+        <w:spacing w:after="0" w:line="240" w:lineRule="auto"/>
+        <w:ind w:left="709"/>
+        <w:shd w:val="clear" w:color="auto" w:fill="F2F2F2"/>
+      </w:pPr>
+      <w:r>
+        <w:rPr>
+          <w:rFonts w:ascii="Courier New" w:hAnsi="Courier New" w:cs="Courier New"/>
+          <w:sz w:val="22"/>
+          <w:szCs w:val="22"/>
+        </w:rPr>
+        <w:t xml:space="preserve">import SwiftUI</w:t>
+      </w:r>
+    </w:p>
+    <w:p>
+      <w:pPr>
+        <w:spacing w:after="0" w:line="240" w:lineRule="auto"/>
+        <w:ind w:left="709"/>
+        <w:shd w:val="clear" w:color="auto" w:fill="F2F2F2"/>
+      </w:pPr>
+      <w:r>
+        <w:rPr>
+          <w:rFonts w:ascii="Courier New" w:hAnsi="Courier New" w:cs="Courier New"/>
+          <w:sz w:val="22"/>
+          <w:szCs w:val="22"/>
+        </w:rPr>
+        <w:t xml:space="preserve"/>
+      </w:r>
+    </w:p>
+    <w:p>
+      <w:pPr>
+        <w:spacing w:after="0" w:line="240" w:lineRule="auto"/>
+        <w:ind w:left="709"/>
+        <w:shd w:val="clear" w:color="auto" w:fill="F2F2F2"/>
+      </w:pPr>
+      <w:r>
+        <w:rPr>
+          <w:rFonts w:ascii="Courier New" w:hAnsi="Courier New" w:cs="Courier New"/>
+          <w:sz w:val="22"/>
+          <w:szCs w:val="22"/>
+        </w:rPr>
+        <w:t xml:space="preserve">struct ContentView: View {</w:t>
+      </w:r>
+    </w:p>
+    <w:p>
+      <w:pPr>
+        <w:spacing w:after="0" w:line="240" w:lineRule="auto"/>
+        <w:ind w:left="709"/>
+        <w:shd w:val="clear" w:color="auto" w:fill="F2F2F2"/>
+      </w:pPr>
+      <w:r>
+        <w:rPr>
+          <w:rFonts w:ascii="Courier New" w:hAnsi="Courier New" w:cs="Courier New"/>
+          <w:sz w:val="22"/>
+          <w:szCs w:val="22"/>
+        </w:rPr>
+        <w:t xml:space="preserve">    @State private var soni = 0</w:t>
+      </w:r>
+    </w:p>
+    <w:p>
+      <w:pPr>
+        <w:spacing w:after="0" w:line="240" w:lineRule="auto"/>
+        <w:ind w:left="709"/>
+        <w:shd w:val="clear" w:color="auto" w:fill="F2F2F2"/>
+      </w:pPr>
+      <w:r>
+        <w:rPr>
+          <w:rFonts w:ascii="Courier New" w:hAnsi="Courier New" w:cs="Courier New"/>
+          <w:sz w:val="22"/>
+          <w:szCs w:val="22"/>
+        </w:rPr>
+        <w:t xml:space="preserve">    var body: some View {</w:t>
+      </w:r>
+    </w:p>
+    <w:p>
+      <w:pPr>
+        <w:spacing w:after="0" w:line="240" w:lineRule="auto"/>
+        <w:ind w:left="709"/>
+        <w:shd w:val="clear" w:color="auto" w:fill="F2F2F2"/>
+      </w:pPr>
+      <w:r>
+        <w:rPr>
+          <w:rFonts w:ascii="Courier New" w:hAnsi="Courier New" w:cs="Courier New"/>
+          <w:sz w:val="22"/>
+          <w:szCs w:val="22"/>
+        </w:rPr>
+        <w:t xml:space="preserve">        VStack {</w:t>
+      </w:r>
+    </w:p>
+    <w:p>
+      <w:pPr>
+        <w:spacing w:after="0" w:line="240" w:lineRule="auto"/>
+        <w:ind w:left="709"/>
+        <w:shd w:val="clear" w:color="auto" w:fill="F2F2F2"/>
+      </w:pPr>
+      <w:r>
+        <w:rPr>
+          <w:rFonts w:ascii="Courier New" w:hAnsi="Courier New" w:cs="Courier New"/>
+          <w:sz w:val="22"/>
+          <w:szCs w:val="22"/>
+        </w:rPr>
+        <w:t xml:space="preserve">            Text("Bosildi: \(soni) marta")</w:t>
+      </w:r>
+    </w:p>
+    <w:p>
+      <w:pPr>
+        <w:spacing w:after="0" w:line="240" w:lineRule="auto"/>
+        <w:ind w:left="709"/>
+        <w:shd w:val="clear" w:color="auto" w:fill="F2F2F2"/>
+      </w:pPr>
+      <w:r>
+        <w:rPr>
+          <w:rFonts w:ascii="Courier New" w:hAnsi="Courier New" w:cs="Courier New"/>
+          <w:sz w:val="22"/>
+          <w:szCs w:val="22"/>
+        </w:rPr>
+        <w:t xml:space="preserve">            Button("Bosing") { soni += 1 }</w:t>
+      </w:r>
+    </w:p>
+    <w:p>
+      <w:pPr>
+        <w:spacing w:after="0" w:line="240" w:lineRule="auto"/>
+        <w:ind w:left="709"/>
+        <w:shd w:val="clear" w:color="auto" w:fill="F2F2F2"/>
+      </w:pPr>
+      <w:r>
+        <w:rPr>
+          <w:rFonts w:ascii="Courier New" w:hAnsi="Courier New" w:cs="Courier New"/>
+          <w:sz w:val="22"/>
+          <w:szCs w:val="22"/>
+        </w:rPr>
+        <w:t xml:space="preserve">        }</w:t>
+      </w:r>
+    </w:p>
+    <w:p>
+      <w:pPr>
+        <w:spacing w:after="0" w:line="240" w:lineRule="auto"/>
+        <w:ind w:left="709"/>
+        <w:shd w:val="clear" w:color="auto" w:fill="F2F2F2"/>
+      </w:pPr>
+      <w:r>
+        <w:rPr>
+          <w:rFonts w:ascii="Courier New" w:hAnsi="Courier New" w:cs="Courier New"/>
+          <w:sz w:val="22"/>
+          <w:szCs w:val="22"/>
+        </w:rPr>
+        <w:t xml:space="preserve">    }</w:t>
+      </w:r>
+    </w:p>
+    <w:p>
+      <w:pPr>
+        <w:spacing w:after="0" w:line="240" w:lineRule="auto"/>
+        <w:ind w:left="709"/>
+        <w:shd w:val="clear" w:color="auto" w:fill="F2F2F2"/>
+      </w:pPr>
+      <w:r>
+        <w:rPr>
+          <w:rFonts w:ascii="Courier New" w:hAnsi="Courier New" w:cs="Courier New"/>
+          <w:sz w:val="22"/>
+          <w:szCs w:val="22"/>
+        </w:rPr>
+        <w:t xml:space="preserve">}</w:t>
+      </w:r>
+    </w:p>
+    <w:p>
+      <w:pPr>
+        <w:spacing w:after="120"/>
+      </w:pPr>
     </w:p>
     <w:p>
       <w:pPr>
@@ -1737,7 +3417,12 @@
           <w:sz w:val="28"/>
           <w:szCs w:val="28"/>
         </w:rPr>
-        <w:t xml:space="preserve">Ikkinchidan, App Store ning qat'iy moderatsiyasi foydalanuvchilarni zararli dasturlardan himoya qilsa-da, dasturchilar uchun ma'lum cheklov va komissiyalarni keltirib chiqaradi. Shaxsiy fikrimcha, SwiftUI va Core ML kabi zamonaviy freymvorklarning paydo bo'lishi iOS ni dasturchilar uchun yanada qulay va istiqbolli platformaga aylantirmoqda. Lightning dan USB-C ga o'tish esa Apple ning yopiq siyosatdan asta-sekin universal standartlarga moyillik ko'rsatayotganidan dalolat beradi. Umuman olganda, iOS xavfsizlik va foydalanuvchi tajribasi muvozanatini ta'minlash bo'yicha sohada etalon bo'lib qolmoqda.</w:t>
+        <w:t xml:space="preserve">Ushbu misol SwiftUI ning deklarativ tabiatini ko'rsatadi: biz interfeysni qadamma-qadam yasamaymiz, balki uning qanday ko'rinishini tavsiflaymiz. @State o'zgaruvchisi o'zgarganda, SwiftUI interfeysni avtomatik yangilaydi. Bu UIKit ga nisbatan ancha qisqa va o'qilishi oson koddir.</w:t>
+      </w:r>
+    </w:p>
+    <w:p>
+      <w:r>
+        <w:br w:type="page"/>
       </w:r>
     </w:p>
     <w:p>
@@ -1753,12 +3438,78 @@
           <w:sz w:val="30"/>
           <w:szCs w:val="30"/>
         </w:rPr>
+        <w:t xml:space="preserve">XULOSA</w:t>
+      </w:r>
+    </w:p>
+    <w:p>
+      <w:pPr>
+        <w:spacing w:after="120" w:line="360" w:lineRule="auto"/>
+        <w:jc w:val="both"/>
+        <w:ind w:firstLine="709"/>
+      </w:pPr>
+      <w:r>
+        <w:rPr>
+          <w:rFonts w:ascii="Times New Roman" w:hAnsi="Times New Roman" w:cs="Times New Roman"/>
+          <w:sz w:val="28"/>
+          <w:szCs w:val="28"/>
+        </w:rPr>
+        <w:t xml:space="preserve">Ushbu mustaqil ish doirasida Apple kompaniyasining iOS mobil operatsion tizimi — uning xavfsizlik arxitekturasi, dasturlash freymvorklari, App Store ekotizimi va rivojlanish evolyutsiyasi har tomonlama tahlil qilindi.</w:t>
+      </w:r>
+    </w:p>
+    <w:p>
+      <w:pPr>
+        <w:spacing w:after="120" w:line="360" w:lineRule="auto"/>
+        <w:jc w:val="both"/>
+        <w:ind w:firstLine="709"/>
+      </w:pPr>
+      <w:r>
+        <w:rPr>
+          <w:rFonts w:ascii="Times New Roman" w:hAnsi="Times New Roman" w:cs="Times New Roman"/>
+          <w:sz w:val="28"/>
+          <w:szCs w:val="28"/>
+        </w:rPr>
+        <w:t xml:space="preserve">Olib borilgan tahlil natijasida quyidagi xulosalarni shakllantirish mumkin. Birinchidan, iOS ning asosiy kuchi uning apparat va dasturiy ta'minotni yagona kompaniya nazorat qiladigan yopiq, lekin yaxlit ekotizimida namoyon bo'ladi. Boot ROM dan tortib Secure Enclave va Sandboxing gacha bo'lgan ko'p qatlamli himoya iOS ni bozordagi eng xavfsiz mobil platformalardan biriga aylantiradi.</w:t>
+      </w:r>
+    </w:p>
+    <w:p>
+      <w:pPr>
+        <w:spacing w:after="120" w:line="360" w:lineRule="auto"/>
+        <w:jc w:val="both"/>
+        <w:ind w:firstLine="709"/>
+      </w:pPr>
+      <w:r>
+        <w:rPr>
+          <w:rFonts w:ascii="Times New Roman" w:hAnsi="Times New Roman" w:cs="Times New Roman"/>
+          <w:sz w:val="28"/>
+          <w:szCs w:val="28"/>
+        </w:rPr>
+        <w:t xml:space="preserve">Ikkinchidan, App Store ning qat'iy moderatsiyasi foydalanuvchilarni zararli dasturlardan himoya qilsa-da, dasturchilar uchun ma'lum cheklov va komissiyalarni keltirib chiqaradi. Shaxsiy fikrimcha, SwiftUI va Core ML kabi zamonaviy freymvorklarning paydo bo'lishi iOS ni dasturchilar uchun yanada qulay va istiqbolli platformaga aylantirmoqda. Lightning dan USB-C ga o'tish esa Apple ning yopiq siyosatdan asta-sekin universal standartlarga moyillik ko'rsatayotganidan dalolat beradi. Umuman olganda, iOS xavfsizlik va foydalanuvchi tajribasi muvozanatini ta'minlash bo'yicha sohada etalon bo'lib qolmoqda.</w:t>
+      </w:r>
+    </w:p>
+    <w:p>
+      <w:r>
+        <w:br w:type="page"/>
+      </w:r>
+    </w:p>
+    <w:p>
+      <w:pPr>
+        <w:pStyle w:val="1"/>
+        <w:spacing w:before="240" w:after="120"/>
+      </w:pPr>
+      <w:r>
+        <w:rPr>
+          <w:rFonts w:ascii="Times New Roman" w:hAnsi="Times New Roman" w:cs="Times New Roman"/>
+          <w:b/>
+          <w:bCs/>
+          <w:sz w:val="30"/>
+          <w:szCs w:val="30"/>
+        </w:rPr>
         <w:t xml:space="preserve">FOYDALANILGAN ADABIYOTLAR</w:t>
       </w:r>
     </w:p>
     <w:p>
       <w:pPr>
-        <w:spacing w:after="60" w:line="360" w:lineRule="auto"/>
+        <w:spacing w:after="80" w:line="360" w:lineRule="auto"/>
         <w:jc w:val="both"/>
       </w:pPr>
       <w:r>
@@ -1772,7 +3523,7 @@
     </w:p>
     <w:p>
       <w:pPr>
-        <w:spacing w:after="60" w:line="360" w:lineRule="auto"/>
+        <w:spacing w:after="80" w:line="360" w:lineRule="auto"/>
         <w:jc w:val="both"/>
       </w:pPr>
       <w:r>
@@ -1786,7 +3537,7 @@
     </w:p>
     <w:p>
       <w:pPr>
-        <w:spacing w:after="60" w:line="360" w:lineRule="auto"/>
+        <w:spacing w:after="80" w:line="360" w:lineRule="auto"/>
         <w:jc w:val="both"/>
       </w:pPr>
       <w:r>
@@ -1800,7 +3551,7 @@
     </w:p>
     <w:p>
       <w:pPr>
-        <w:spacing w:after="60" w:line="360" w:lineRule="auto"/>
+        <w:spacing w:after="80" w:line="360" w:lineRule="auto"/>
         <w:jc w:val="both"/>
       </w:pPr>
       <w:r>
@@ -1814,7 +3565,7 @@
     </w:p>
     <w:p>
       <w:pPr>
-        <w:spacing w:after="60" w:line="360" w:lineRule="auto"/>
+        <w:spacing w:after="80" w:line="360" w:lineRule="auto"/>
         <w:jc w:val="both"/>
       </w:pPr>
       <w:r>
@@ -1828,7 +3579,7 @@
     </w:p>
     <w:p>
       <w:pPr>
-        <w:spacing w:after="60" w:line="360" w:lineRule="auto"/>
+        <w:spacing w:after="80" w:line="360" w:lineRule="auto"/>
         <w:jc w:val="both"/>
       </w:pPr>
       <w:r>
@@ -1838,6 +3589,20 @@
           <w:szCs w:val="28"/>
         </w:rPr>
         <w:t xml:space="preserve">6. Tanenbaum A.S., Bos H. Modern Operating Systems. 5th ed. — Pearson, 2023.</w:t>
+      </w:r>
+    </w:p>
+    <w:p>
+      <w:pPr>
+        <w:spacing w:after="80" w:line="360" w:lineRule="auto"/>
+        <w:jc w:val="both"/>
+      </w:pPr>
+      <w:r>
+        <w:rPr>
+          <w:rFonts w:ascii="Times New Roman" w:hAnsi="Times New Roman" w:cs="Times New Roman"/>
+          <w:sz w:val="28"/>
+          <w:szCs w:val="28"/>
+        </w:rPr>
+        <w:t xml:space="preserve">7. StatCounter GlobalStats. Mobile Operating System Market Share. — gs.statcounter.com.</w:t>
       </w:r>
     </w:p>
     <w:sectPr>

</xml_diff>